<commit_message>
Clarify figure and table analysis references
</commit_message>
<xml_diff>
--- a/reports/thesis/submission/CP2_Final_Report_Ng_Yi_Zhen.docx
+++ b/reports/thesis/submission/CP2_Final_Report_Ng_Yi_Zhen.docx
@@ -1222,7 +1222,7 @@
           <w:sz w:val="22"/>
         </w:rPr>
         <w:tab/>
-        <w:t>15</w:t>
+        <w:t>16</w:t>
       </w:r>
     </w:p>
     <w:p>
@@ -1245,7 +1245,7 @@
           <w:sz w:val="22"/>
         </w:rPr>
         <w:tab/>
-        <w:t>17</w:t>
+        <w:t>18</w:t>
       </w:r>
     </w:p>
     <w:p>
@@ -1261,6 +1261,520 @@
           <w:sz w:val="22"/>
         </w:rPr>
         <w:t>Table 3.3. S0 semantic feature catalogue and operational meaning</w:t>
+      </w:r>
+      <w:r>
+        <w:rPr>
+          <w:rFonts w:ascii="Times New Roman" w:hAnsi="Times New Roman"/>
+          <w:sz w:val="22"/>
+        </w:rPr>
+        <w:tab/>
+        <w:t>27</w:t>
+      </w:r>
+    </w:p>
+    <w:p>
+      <w:pPr>
+        <w:tabs>
+          <w:tab w:pos="8901" w:val="right" w:leader="dot"/>
+        </w:tabs>
+        <w:spacing w:before="0" w:after="60" w:line="240" w:lineRule="auto"/>
+      </w:pPr>
+      <w:r>
+        <w:rPr>
+          <w:rFonts w:ascii="Times New Roman" w:hAnsi="Times New Roman"/>
+          <w:sz w:val="22"/>
+        </w:rPr>
+        <w:t>Table 4.1. Dataset integrity and seed-42 split counts</w:t>
+      </w:r>
+      <w:r>
+        <w:rPr>
+          <w:rFonts w:ascii="Times New Roman" w:hAnsi="Times New Roman"/>
+          <w:sz w:val="22"/>
+        </w:rPr>
+        <w:tab/>
+        <w:t>31</w:t>
+      </w:r>
+    </w:p>
+    <w:p>
+      <w:pPr>
+        <w:tabs>
+          <w:tab w:pos="8901" w:val="right" w:leader="dot"/>
+        </w:tabs>
+        <w:spacing w:before="0" w:after="60" w:line="240" w:lineRule="auto"/>
+      </w:pPr>
+      <w:r>
+        <w:rPr>
+          <w:rFonts w:ascii="Times New Roman" w:hAnsi="Times New Roman"/>
+          <w:sz w:val="22"/>
+        </w:rPr>
+        <w:t>Table 4.2. Five-seed detector performance</w:t>
+      </w:r>
+      <w:r>
+        <w:rPr>
+          <w:rFonts w:ascii="Times New Roman" w:hAnsi="Times New Roman"/>
+          <w:sz w:val="22"/>
+        </w:rPr>
+        <w:tab/>
+        <w:t>31</w:t>
+      </w:r>
+    </w:p>
+    <w:p>
+      <w:pPr>
+        <w:tabs>
+          <w:tab w:pos="8901" w:val="right" w:leader="dot"/>
+        </w:tabs>
+        <w:spacing w:before="0" w:after="60" w:line="240" w:lineRule="auto"/>
+      </w:pPr>
+      <w:r>
+        <w:rPr>
+          <w:rFonts w:ascii="Times New Roman" w:hAnsi="Times New Roman"/>
+          <w:sz w:val="22"/>
+        </w:rPr>
+        <w:t>Table 4.3. Frozen G6 seed-42 performance</w:t>
+      </w:r>
+      <w:r>
+        <w:rPr>
+          <w:rFonts w:ascii="Times New Roman" w:hAnsi="Times New Roman"/>
+          <w:sz w:val="22"/>
+        </w:rPr>
+        <w:tab/>
+        <w:t>35</w:t>
+      </w:r>
+    </w:p>
+    <w:p>
+      <w:pPr>
+        <w:tabs>
+          <w:tab w:pos="8901" w:val="right" w:leader="dot"/>
+        </w:tabs>
+        <w:spacing w:before="0" w:after="60" w:line="240" w:lineRule="auto"/>
+      </w:pPr>
+      <w:r>
+        <w:rPr>
+          <w:rFonts w:ascii="Times New Roman" w:hAnsi="Times New Roman"/>
+          <w:sz w:val="22"/>
+        </w:rPr>
+        <w:t>Table 4.4. Validator calibration outcomes</w:t>
+      </w:r>
+      <w:r>
+        <w:rPr>
+          <w:rFonts w:ascii="Times New Roman" w:hAnsi="Times New Roman"/>
+          <w:sz w:val="22"/>
+        </w:rPr>
+        <w:tab/>
+        <w:t>36</w:t>
+      </w:r>
+    </w:p>
+    <w:p>
+      <w:pPr>
+        <w:tabs>
+          <w:tab w:pos="8901" w:val="right" w:leader="dot"/>
+        </w:tabs>
+        <w:spacing w:before="0" w:after="60" w:line="240" w:lineRule="auto"/>
+      </w:pPr>
+      <w:r>
+        <w:rPr>
+          <w:rFonts w:ascii="Times New Roman" w:hAnsi="Times New Roman"/>
+          <w:sz w:val="22"/>
+        </w:rPr>
+        <w:t>Table 4.5. Strict and simple prompt outcomes</w:t>
+      </w:r>
+      <w:r>
+        <w:rPr>
+          <w:rFonts w:ascii="Times New Roman" w:hAnsi="Times New Roman"/>
+          <w:sz w:val="22"/>
+        </w:rPr>
+        <w:tab/>
+        <w:t>37</w:t>
+      </w:r>
+    </w:p>
+    <w:p>
+      <w:pPr>
+        <w:tabs>
+          <w:tab w:pos="8901" w:val="right" w:leader="dot"/>
+        </w:tabs>
+        <w:spacing w:before="0" w:after="60" w:line="240" w:lineRule="auto"/>
+      </w:pPr>
+      <w:r>
+        <w:rPr>
+          <w:rFonts w:ascii="Times New Roman" w:hAnsi="Times New Roman"/>
+          <w:sz w:val="22"/>
+        </w:rPr>
+        <w:t>Table 4.6. S0 synthetic stream and chronological split counts</w:t>
+      </w:r>
+      <w:r>
+        <w:rPr>
+          <w:rFonts w:ascii="Times New Roman" w:hAnsi="Times New Roman"/>
+          <w:sz w:val="22"/>
+        </w:rPr>
+        <w:tab/>
+        <w:t>44</w:t>
+      </w:r>
+    </w:p>
+    <w:p>
+      <w:pPr>
+        <w:tabs>
+          <w:tab w:pos="8901" w:val="right" w:leader="dot"/>
+        </w:tabs>
+        <w:spacing w:before="0" w:after="60" w:line="240" w:lineRule="auto"/>
+      </w:pPr>
+      <w:r>
+        <w:rPr>
+          <w:rFonts w:ascii="Times New Roman" w:hAnsi="Times New Roman"/>
+          <w:sz w:val="22"/>
+        </w:rPr>
+        <w:t>Table 4.7. S0 detector performance at the validation-selected threshold</w:t>
+      </w:r>
+      <w:r>
+        <w:rPr>
+          <w:rFonts w:ascii="Times New Roman" w:hAnsi="Times New Roman"/>
+          <w:sz w:val="22"/>
+        </w:rPr>
+        <w:tab/>
+        <w:t>44</w:t>
+      </w:r>
+    </w:p>
+    <w:p>
+      <w:pPr>
+        <w:tabs>
+          <w:tab w:pos="8901" w:val="right" w:leader="dot"/>
+        </w:tabs>
+        <w:spacing w:before="0" w:after="60" w:line="240" w:lineRule="auto"/>
+      </w:pPr>
+      <w:r>
+        <w:rPr>
+          <w:rFonts w:ascii="Times New Roman" w:hAnsi="Times New Roman"/>
+          <w:sz w:val="22"/>
+        </w:rPr>
+        <w:t>Table 4.8. S0 explanation assurance outcomes</w:t>
+      </w:r>
+      <w:r>
+        <w:rPr>
+          <w:rFonts w:ascii="Times New Roman" w:hAnsi="Times New Roman"/>
+          <w:sz w:val="22"/>
+        </w:rPr>
+        <w:tab/>
+        <w:t>46</w:t>
+      </w:r>
+    </w:p>
+    <w:p>
+      <w:pPr>
+        <w:tabs>
+          <w:tab w:pos="8901" w:val="right" w:leader="dot"/>
+        </w:tabs>
+        <w:spacing w:before="0" w:after="60" w:line="240" w:lineRule="auto"/>
+      </w:pPr>
+      <w:r>
+        <w:rPr>
+          <w:rFonts w:ascii="Times New Roman" w:hAnsi="Times New Roman"/>
+          <w:sz w:val="22"/>
+        </w:rPr>
+        <w:t>Table 4.9. S0 deterministic and guarded-LLM brief comparison</w:t>
+      </w:r>
+      <w:r>
+        <w:rPr>
+          <w:rFonts w:ascii="Times New Roman" w:hAnsi="Times New Roman"/>
+          <w:sz w:val="22"/>
+        </w:rPr>
+        <w:tab/>
+        <w:t>47</w:t>
+      </w:r>
+    </w:p>
+    <w:p>
+      <w:pPr>
+        <w:tabs>
+          <w:tab w:pos="8901" w:val="right" w:leader="dot"/>
+        </w:tabs>
+        <w:spacing w:before="0" w:after="60" w:line="240" w:lineRule="auto"/>
+      </w:pPr>
+      <w:r>
+        <w:rPr>
+          <w:rFonts w:ascii="Times New Roman" w:hAnsi="Times New Roman"/>
+          <w:sz w:val="22"/>
+        </w:rPr>
+        <w:t>Table 4.10. Interim human evaluation participant profile</w:t>
+      </w:r>
+      <w:r>
+        <w:rPr>
+          <w:rFonts w:ascii="Times New Roman" w:hAnsi="Times New Roman"/>
+          <w:sz w:val="22"/>
+        </w:rPr>
+        <w:tab/>
+        <w:t>48</w:t>
+      </w:r>
+    </w:p>
+    <w:p>
+      <w:pPr>
+        <w:tabs>
+          <w:tab w:pos="8901" w:val="right" w:leader="dot"/>
+        </w:tabs>
+        <w:spacing w:before="0" w:after="60" w:line="240" w:lineRule="auto"/>
+      </w:pPr>
+      <w:r>
+        <w:rPr>
+          <w:rFonts w:ascii="Times New Roman" w:hAnsi="Times New Roman"/>
+          <w:sz w:val="22"/>
+        </w:rPr>
+        <w:t>Table 4.11. Interim human evaluation comprehension accuracy</w:t>
+      </w:r>
+      <w:r>
+        <w:rPr>
+          <w:rFonts w:ascii="Times New Roman" w:hAnsi="Times New Roman"/>
+          <w:sz w:val="22"/>
+        </w:rPr>
+        <w:tab/>
+        <w:t>48</w:t>
+      </w:r>
+    </w:p>
+    <w:p>
+      <w:pPr>
+        <w:tabs>
+          <w:tab w:pos="8901" w:val="right" w:leader="dot"/>
+        </w:tabs>
+        <w:spacing w:before="0" w:after="60" w:line="240" w:lineRule="auto"/>
+      </w:pPr>
+      <w:r>
+        <w:rPr>
+          <w:rFonts w:ascii="Times New Roman" w:hAnsi="Times New Roman"/>
+          <w:sz w:val="22"/>
+        </w:rPr>
+        <w:t>Table 4.12. Interim human evaluation rating summaries</w:t>
+      </w:r>
+      <w:r>
+        <w:rPr>
+          <w:rFonts w:ascii="Times New Roman" w:hAnsi="Times New Roman"/>
+          <w:sz w:val="22"/>
+        </w:rPr>
+        <w:tab/>
+        <w:t>49</w:t>
+      </w:r>
+    </w:p>
+    <w:p>
+      <w:pPr>
+        <w:tabs>
+          <w:tab w:pos="8901" w:val="right" w:leader="dot"/>
+        </w:tabs>
+        <w:spacing w:before="0" w:after="60" w:line="240" w:lineRule="auto"/>
+      </w:pPr>
+      <w:r>
+        <w:rPr>
+          <w:rFonts w:ascii="Times New Roman" w:hAnsi="Times New Roman"/>
+          <w:sz w:val="22"/>
+        </w:rPr>
+        <w:t>Table 4.13. Interim human evaluation format preferences</w:t>
+      </w:r>
+      <w:r>
+        <w:rPr>
+          <w:rFonts w:ascii="Times New Roman" w:hAnsi="Times New Roman"/>
+          <w:sz w:val="22"/>
+        </w:rPr>
+        <w:tab/>
+        <w:t>49</w:t>
+      </w:r>
+    </w:p>
+    <w:p>
+      <w:pPr>
+        <w:tabs>
+          <w:tab w:pos="8901" w:val="right" w:leader="dot"/>
+        </w:tabs>
+        <w:spacing w:before="0" w:after="60" w:line="240" w:lineRule="auto"/>
+      </w:pPr>
+      <w:r>
+        <w:rPr>
+          <w:rFonts w:ascii="Times New Roman" w:hAnsi="Times New Roman"/>
+          <w:sz w:val="22"/>
+        </w:rPr>
+        <w:t>Table 4.14. Research question summary</w:t>
+      </w:r>
+      <w:r>
+        <w:rPr>
+          <w:rFonts w:ascii="Times New Roman" w:hAnsi="Times New Roman"/>
+          <w:sz w:val="22"/>
+        </w:rPr>
+        <w:tab/>
+        <w:t>51</w:t>
+      </w:r>
+    </w:p>
+    <w:p>
+      <w:pPr>
+        <w:tabs>
+          <w:tab w:pos="8901" w:val="right" w:leader="dot"/>
+        </w:tabs>
+        <w:spacing w:before="0" w:after="60" w:line="240" w:lineRule="auto"/>
+      </w:pPr>
+      <w:r>
+        <w:rPr>
+          <w:rFonts w:ascii="Times New Roman" w:hAnsi="Times New Roman"/>
+          <w:sz w:val="22"/>
+        </w:rPr>
+        <w:t>Table 5.1. Achievement of project objectives</w:t>
+      </w:r>
+      <w:r>
+        <w:rPr>
+          <w:rFonts w:ascii="Times New Roman" w:hAnsi="Times New Roman"/>
+          <w:sz w:val="22"/>
+        </w:rPr>
+        <w:tab/>
+        <w:t>59</w:t>
+      </w:r>
+    </w:p>
+    <w:p>
+      <w:pPr>
+        <w:tabs>
+          <w:tab w:pos="8901" w:val="right" w:leader="dot"/>
+        </w:tabs>
+        <w:spacing w:before="0" w:after="60" w:line="240" w:lineRule="auto"/>
+      </w:pPr>
+      <w:r>
+        <w:rPr>
+          <w:rFonts w:ascii="Times New Roman" w:hAnsi="Times New Roman"/>
+          <w:sz w:val="22"/>
+        </w:rPr>
+        <w:t>Table A.1. Experiment and evidence map</w:t>
+      </w:r>
+      <w:r>
+        <w:rPr>
+          <w:rFonts w:ascii="Times New Roman" w:hAnsi="Times New Roman"/>
+          <w:sz w:val="22"/>
+        </w:rPr>
+        <w:tab/>
+        <w:t>65</w:t>
+      </w:r>
+    </w:p>
+    <w:p>
+      <w:pPr>
+        <w:tabs>
+          <w:tab w:pos="8901" w:val="right" w:leader="dot"/>
+        </w:tabs>
+        <w:spacing w:before="0" w:after="60" w:line="240" w:lineRule="auto"/>
+      </w:pPr>
+      <w:r>
+        <w:rPr>
+          <w:rFonts w:ascii="Times New Roman" w:hAnsi="Times New Roman"/>
+          <w:sz w:val="22"/>
+        </w:rPr>
+        <w:t>Table B.1. Software and reproducibility summary</w:t>
+      </w:r>
+      <w:r>
+        <w:rPr>
+          <w:rFonts w:ascii="Times New Roman" w:hAnsi="Times New Roman"/>
+          <w:sz w:val="22"/>
+        </w:rPr>
+        <w:tab/>
+        <w:t>67</w:t>
+      </w:r>
+    </w:p>
+    <w:p>
+      <w:pPr>
+        <w:tabs>
+          <w:tab w:pos="8901" w:val="right" w:leader="dot"/>
+        </w:tabs>
+        <w:spacing w:before="0" w:after="60" w:line="240" w:lineRule="auto"/>
+      </w:pPr>
+      <w:r>
+        <w:rPr>
+          <w:rFonts w:ascii="Times New Roman" w:hAnsi="Times New Roman"/>
+          <w:sz w:val="22"/>
+        </w:rPr>
+        <w:t>Table E.1. Supporting detector ranking metrics</w:t>
+      </w:r>
+      <w:r>
+        <w:rPr>
+          <w:rFonts w:ascii="Times New Roman" w:hAnsi="Times New Roman"/>
+          <w:sz w:val="22"/>
+        </w:rPr>
+        <w:tab/>
+        <w:t>73</w:t>
+      </w:r>
+    </w:p>
+    <w:p>
+      <w:pPr>
+        <w:tabs>
+          <w:tab w:pos="8901" w:val="right" w:leader="dot"/>
+        </w:tabs>
+        <w:spacing w:before="0" w:after="60" w:line="240" w:lineRule="auto"/>
+      </w:pPr>
+      <w:r>
+        <w:rPr>
+          <w:rFonts w:ascii="Times New Roman" w:hAnsi="Times New Roman"/>
+          <w:sz w:val="22"/>
+        </w:rPr>
+        <w:t>Table E.2. Supporting detector confusion counts and runtime</w:t>
+      </w:r>
+      <w:r>
+        <w:rPr>
+          <w:rFonts w:ascii="Times New Roman" w:hAnsi="Times New Roman"/>
+          <w:sz w:val="22"/>
+        </w:rPr>
+        <w:tab/>
+        <w:t>73</w:t>
+      </w:r>
+    </w:p>
+    <w:p>
+      <w:pPr>
+        <w:pStyle w:val="Heading1"/>
+      </w:pPr>
+      <w:r>
+        <w:t>List of Figures</w:t>
+      </w:r>
+    </w:p>
+    <w:p>
+      <w:pPr>
+        <w:tabs>
+          <w:tab w:pos="8901" w:val="right" w:leader="dot"/>
+        </w:tabs>
+        <w:spacing w:before="0" w:after="60" w:line="240" w:lineRule="auto"/>
+      </w:pPr>
+      <w:r>
+        <w:rPr>
+          <w:rFonts w:ascii="Times New Roman" w:hAnsi="Times New Roman"/>
+          <w:sz w:val="22"/>
+        </w:rPr>
+        <w:t>Figure 3.1. CP2 system architecture and evidence boundary</w:t>
+      </w:r>
+      <w:r>
+        <w:rPr>
+          <w:rFonts w:ascii="Times New Roman" w:hAnsi="Times New Roman"/>
+          <w:sz w:val="22"/>
+        </w:rPr>
+        <w:tab/>
+        <w:t>13</w:t>
+      </w:r>
+    </w:p>
+    <w:p>
+      <w:pPr>
+        <w:tabs>
+          <w:tab w:pos="8901" w:val="right" w:leader="dot"/>
+        </w:tabs>
+        <w:spacing w:before="0" w:after="60" w:line="240" w:lineRule="auto"/>
+      </w:pPr>
+      <w:r>
+        <w:rPr>
+          <w:rFonts w:ascii="Times New Roman" w:hAnsi="Times New Roman"/>
+          <w:sz w:val="22"/>
+        </w:rPr>
+        <w:t>Figure 3.2. Unified Alert Queue for operational and research review work</w:t>
+      </w:r>
+      <w:r>
+        <w:rPr>
+          <w:rFonts w:ascii="Times New Roman" w:hAnsi="Times New Roman"/>
+          <w:sz w:val="22"/>
+        </w:rPr>
+        <w:tab/>
+        <w:t>25</w:t>
+      </w:r>
+    </w:p>
+    <w:p>
+      <w:pPr>
+        <w:tabs>
+          <w:tab w:pos="8901" w:val="right" w:leader="dot"/>
+        </w:tabs>
+        <w:spacing w:before="0" w:after="60" w:line="240" w:lineRule="auto"/>
+      </w:pPr>
+      <w:r>
+        <w:rPr>
+          <w:rFonts w:ascii="Times New Roman" w:hAnsi="Times New Roman"/>
+          <w:sz w:val="22"/>
+        </w:rPr>
+        <w:t>Figure 3.3. Case Review evidence brief and bounded local-LLM note</w:t>
       </w:r>
       <w:r>
         <w:rPr>
@@ -1283,7 +1797,7 @@
           <w:rFonts w:ascii="Times New Roman" w:hAnsi="Times New Roman"/>
           <w:sz w:val="22"/>
         </w:rPr>
-        <w:t>Table 4.1. Dataset integrity and seed-42 split counts</w:t>
+        <w:t>Figure 4.1. Detector metric comparison across five seeds</w:t>
       </w:r>
       <w:r>
         <w:rPr>
@@ -1291,7 +1805,7 @@
           <w:sz w:val="22"/>
         </w:rPr>
         <w:tab/>
-        <w:t>30</w:t>
+        <w:t>33</w:t>
       </w:r>
     </w:p>
     <w:p>
@@ -1306,30 +1820,7 @@
           <w:rFonts w:ascii="Times New Roman" w:hAnsi="Times New Roman"/>
           <w:sz w:val="22"/>
         </w:rPr>
-        <w:t>Table 4.2. Five-seed detector performance</w:t>
-      </w:r>
-      <w:r>
-        <w:rPr>
-          <w:rFonts w:ascii="Times New Roman" w:hAnsi="Times New Roman"/>
-          <w:sz w:val="22"/>
-        </w:rPr>
-        <w:tab/>
-        <w:t>30</w:t>
-      </w:r>
-    </w:p>
-    <w:p>
-      <w:pPr>
-        <w:tabs>
-          <w:tab w:pos="8901" w:val="right" w:leader="dot"/>
-        </w:tabs>
-        <w:spacing w:before="0" w:after="60" w:line="240" w:lineRule="auto"/>
-      </w:pPr>
-      <w:r>
-        <w:rPr>
-          <w:rFonts w:ascii="Times New Roman" w:hAnsi="Times New Roman"/>
-          <w:sz w:val="22"/>
-        </w:rPr>
-        <w:t>Table 4.3. Frozen G6 seed-42 performance</w:t>
+        <w:t>Figure 4.2. Seed-42 precision-recall curves</w:t>
       </w:r>
       <w:r>
         <w:rPr>
@@ -1352,30 +1843,7 @@
           <w:rFonts w:ascii="Times New Roman" w:hAnsi="Times New Roman"/>
           <w:sz w:val="22"/>
         </w:rPr>
-        <w:t>Table 4.4. Validator calibration outcomes</w:t>
-      </w:r>
-      <w:r>
-        <w:rPr>
-          <w:rFonts w:ascii="Times New Roman" w:hAnsi="Times New Roman"/>
-          <w:sz w:val="22"/>
-        </w:rPr>
-        <w:tab/>
-        <w:t>35</w:t>
-      </w:r>
-    </w:p>
-    <w:p>
-      <w:pPr>
-        <w:tabs>
-          <w:tab w:pos="8901" w:val="right" w:leader="dot"/>
-        </w:tabs>
-        <w:spacing w:before="0" w:after="60" w:line="240" w:lineRule="auto"/>
-      </w:pPr>
-      <w:r>
-        <w:rPr>
-          <w:rFonts w:ascii="Times New Roman" w:hAnsi="Times New Roman"/>
-          <w:sz w:val="22"/>
-        </w:rPr>
-        <w:t>Table 4.5. Strict and simple prompt outcomes</w:t>
+        <w:t>Figure 4.3. Global mean absolute SHAP importance</w:t>
       </w:r>
       <w:r>
         <w:rPr>
@@ -1398,7 +1866,53 @@
           <w:rFonts w:ascii="Times New Roman" w:hAnsi="Times New Roman"/>
           <w:sz w:val="22"/>
         </w:rPr>
-        <w:t>Table 4.6. S0 synthetic stream and chronological split counts</w:t>
+        <w:t>Figure 4.4. Narrative violation, fallback, and acceptance rates</w:t>
+      </w:r>
+      <w:r>
+        <w:rPr>
+          <w:rFonts w:ascii="Times New Roman" w:hAnsi="Times New Roman"/>
+          <w:sz w:val="22"/>
+        </w:rPr>
+        <w:tab/>
+        <w:t>39</w:t>
+      </w:r>
+    </w:p>
+    <w:p>
+      <w:pPr>
+        <w:tabs>
+          <w:tab w:pos="8901" w:val="right" w:leader="dot"/>
+        </w:tabs>
+        <w:spacing w:before="0" w:after="60" w:line="240" w:lineRule="auto"/>
+      </w:pPr>
+      <w:r>
+        <w:rPr>
+          <w:rFonts w:ascii="Times New Roman" w:hAnsi="Times New Roman"/>
+          <w:sz w:val="22"/>
+        </w:rPr>
+        <w:t>Figure 4.5. S0 Explanation Assurance with an unlisted-feature mutation</w:t>
+      </w:r>
+      <w:r>
+        <w:rPr>
+          <w:rFonts w:ascii="Times New Roman" w:hAnsi="Times New Roman"/>
+          <w:sz w:val="22"/>
+        </w:rPr>
+        <w:tab/>
+        <w:t>42</w:t>
+      </w:r>
+    </w:p>
+    <w:p>
+      <w:pPr>
+        <w:tabs>
+          <w:tab w:pos="8901" w:val="right" w:leader="dot"/>
+        </w:tabs>
+        <w:spacing w:before="0" w:after="60" w:line="240" w:lineRule="auto"/>
+      </w:pPr>
+      <w:r>
+        <w:rPr>
+          <w:rFonts w:ascii="Times New Roman" w:hAnsi="Times New Roman"/>
+          <w:sz w:val="22"/>
+        </w:rPr>
+        <w:t>Figure 4.6. S0 direction-flip assurance test</w:t>
       </w:r>
       <w:r>
         <w:rPr>
@@ -1421,7 +1935,7 @@
           <w:rFonts w:ascii="Times New Roman" w:hAnsi="Times New Roman"/>
           <w:sz w:val="22"/>
         </w:rPr>
-        <w:t>Table 4.7. S0 detector performance at the validation-selected threshold</w:t>
+        <w:t>Figure 4.7. S0 detector metrics on the synthetic operational test period</w:t>
       </w:r>
       <w:r>
         <w:rPr>
@@ -1429,7 +1943,7 @@
           <w:sz w:val="22"/>
         </w:rPr>
         <w:tab/>
-        <w:t>43</w:t>
+        <w:t>45</w:t>
       </w:r>
     </w:p>
     <w:p>
@@ -1444,30 +1958,7 @@
           <w:rFonts w:ascii="Times New Roman" w:hAnsi="Times New Roman"/>
           <w:sz w:val="22"/>
         </w:rPr>
-        <w:t>Table 4.8. S0 explanation assurance outcomes</w:t>
-      </w:r>
-      <w:r>
-        <w:rPr>
-          <w:rFonts w:ascii="Times New Roman" w:hAnsi="Times New Roman"/>
-          <w:sz w:val="22"/>
-        </w:rPr>
-        <w:tab/>
-        <w:t>44</w:t>
-      </w:r>
-    </w:p>
-    <w:p>
-      <w:pPr>
-        <w:tabs>
-          <w:tab w:pos="8901" w:val="right" w:leader="dot"/>
-        </w:tabs>
-        <w:spacing w:before="0" w:after="60" w:line="240" w:lineRule="auto"/>
-      </w:pPr>
-      <w:r>
-        <w:rPr>
-          <w:rFonts w:ascii="Times New Roman" w:hAnsi="Times New Roman"/>
-          <w:sz w:val="22"/>
-        </w:rPr>
-        <w:t>Table 4.9. S0 deterministic and guarded-LLM brief comparison</w:t>
+        <w:t>Figure 4.8. S0 explanation assurance outcomes</w:t>
       </w:r>
       <w:r>
         <w:rPr>
@@ -1490,99 +1981,7 @@
           <w:rFonts w:ascii="Times New Roman" w:hAnsi="Times New Roman"/>
           <w:sz w:val="22"/>
         </w:rPr>
-        <w:t>Table 4.10. Interim human evaluation participant profile</w:t>
-      </w:r>
-      <w:r>
-        <w:rPr>
-          <w:rFonts w:ascii="Times New Roman" w:hAnsi="Times New Roman"/>
-          <w:sz w:val="22"/>
-        </w:rPr>
-        <w:tab/>
-        <w:t>47</w:t>
-      </w:r>
-    </w:p>
-    <w:p>
-      <w:pPr>
-        <w:tabs>
-          <w:tab w:pos="8901" w:val="right" w:leader="dot"/>
-        </w:tabs>
-        <w:spacing w:before="0" w:after="60" w:line="240" w:lineRule="auto"/>
-      </w:pPr>
-      <w:r>
-        <w:rPr>
-          <w:rFonts w:ascii="Times New Roman" w:hAnsi="Times New Roman"/>
-          <w:sz w:val="22"/>
-        </w:rPr>
-        <w:t>Table 4.11. Interim human evaluation comprehension accuracy</w:t>
-      </w:r>
-      <w:r>
-        <w:rPr>
-          <w:rFonts w:ascii="Times New Roman" w:hAnsi="Times New Roman"/>
-          <w:sz w:val="22"/>
-        </w:rPr>
-        <w:tab/>
-        <w:t>47</w:t>
-      </w:r>
-    </w:p>
-    <w:p>
-      <w:pPr>
-        <w:tabs>
-          <w:tab w:pos="8901" w:val="right" w:leader="dot"/>
-        </w:tabs>
-        <w:spacing w:before="0" w:after="60" w:line="240" w:lineRule="auto"/>
-      </w:pPr>
-      <w:r>
-        <w:rPr>
-          <w:rFonts w:ascii="Times New Roman" w:hAnsi="Times New Roman"/>
-          <w:sz w:val="22"/>
-        </w:rPr>
-        <w:t>Table 4.12. Interim human evaluation rating summaries</w:t>
-      </w:r>
-      <w:r>
-        <w:rPr>
-          <w:rFonts w:ascii="Times New Roman" w:hAnsi="Times New Roman"/>
-          <w:sz w:val="22"/>
-        </w:rPr>
-        <w:tab/>
-        <w:t>47</w:t>
-      </w:r>
-    </w:p>
-    <w:p>
-      <w:pPr>
-        <w:tabs>
-          <w:tab w:pos="8901" w:val="right" w:leader="dot"/>
-        </w:tabs>
-        <w:spacing w:before="0" w:after="60" w:line="240" w:lineRule="auto"/>
-      </w:pPr>
-      <w:r>
-        <w:rPr>
-          <w:rFonts w:ascii="Times New Roman" w:hAnsi="Times New Roman"/>
-          <w:sz w:val="22"/>
-        </w:rPr>
-        <w:t>Table 4.13. Interim human evaluation format preferences</w:t>
-      </w:r>
-      <w:r>
-        <w:rPr>
-          <w:rFonts w:ascii="Times New Roman" w:hAnsi="Times New Roman"/>
-          <w:sz w:val="22"/>
-        </w:rPr>
-        <w:tab/>
-        <w:t>48</w:t>
-      </w:r>
-    </w:p>
-    <w:p>
-      <w:pPr>
-        <w:tabs>
-          <w:tab w:pos="8901" w:val="right" w:leader="dot"/>
-        </w:tabs>
-        <w:spacing w:before="0" w:after="60" w:line="240" w:lineRule="auto"/>
-      </w:pPr>
-      <w:r>
-        <w:rPr>
-          <w:rFonts w:ascii="Times New Roman" w:hAnsi="Times New Roman"/>
-          <w:sz w:val="22"/>
-        </w:rPr>
-        <w:t>Table 4.14. Research question summary</w:t>
+        <w:t>Figure 4.9. Interim human evaluation comprehension and rating outcomes</w:t>
       </w:r>
       <w:r>
         <w:rPr>
@@ -1605,7 +2004,7 @@
           <w:rFonts w:ascii="Times New Roman" w:hAnsi="Times New Roman"/>
           <w:sz w:val="22"/>
         </w:rPr>
-        <w:t>Table 5.1. Achievement of project objectives</w:t>
+        <w:t>Figure 4.10. Interim human evaluation format preferences</w:t>
       </w:r>
       <w:r>
         <w:rPr>
@@ -1613,406 +2012,7 @@
           <w:sz w:val="22"/>
         </w:rPr>
         <w:tab/>
-        <w:t>58</w:t>
-      </w:r>
-    </w:p>
-    <w:p>
-      <w:pPr>
-        <w:tabs>
-          <w:tab w:pos="8901" w:val="right" w:leader="dot"/>
-        </w:tabs>
-        <w:spacing w:before="0" w:after="60" w:line="240" w:lineRule="auto"/>
-      </w:pPr>
-      <w:r>
-        <w:rPr>
-          <w:rFonts w:ascii="Times New Roman" w:hAnsi="Times New Roman"/>
-          <w:sz w:val="22"/>
-        </w:rPr>
-        <w:t>Table A.1. Experiment and evidence map</w:t>
-      </w:r>
-      <w:r>
-        <w:rPr>
-          <w:rFonts w:ascii="Times New Roman" w:hAnsi="Times New Roman"/>
-          <w:sz w:val="22"/>
-        </w:rPr>
-        <w:tab/>
-        <w:t>64</w:t>
-      </w:r>
-    </w:p>
-    <w:p>
-      <w:pPr>
-        <w:tabs>
-          <w:tab w:pos="8901" w:val="right" w:leader="dot"/>
-        </w:tabs>
-        <w:spacing w:before="0" w:after="60" w:line="240" w:lineRule="auto"/>
-      </w:pPr>
-      <w:r>
-        <w:rPr>
-          <w:rFonts w:ascii="Times New Roman" w:hAnsi="Times New Roman"/>
-          <w:sz w:val="22"/>
-        </w:rPr>
-        <w:t>Table B.1. Software and reproducibility summary</w:t>
-      </w:r>
-      <w:r>
-        <w:rPr>
-          <w:rFonts w:ascii="Times New Roman" w:hAnsi="Times New Roman"/>
-          <w:sz w:val="22"/>
-        </w:rPr>
-        <w:tab/>
-        <w:t>66</w:t>
-      </w:r>
-    </w:p>
-    <w:p>
-      <w:pPr>
-        <w:tabs>
-          <w:tab w:pos="8901" w:val="right" w:leader="dot"/>
-        </w:tabs>
-        <w:spacing w:before="0" w:after="60" w:line="240" w:lineRule="auto"/>
-      </w:pPr>
-      <w:r>
-        <w:rPr>
-          <w:rFonts w:ascii="Times New Roman" w:hAnsi="Times New Roman"/>
-          <w:sz w:val="22"/>
-        </w:rPr>
-        <w:t>Table E.1. Supporting detector ranking metrics</w:t>
-      </w:r>
-      <w:r>
-        <w:rPr>
-          <w:rFonts w:ascii="Times New Roman" w:hAnsi="Times New Roman"/>
-          <w:sz w:val="22"/>
-        </w:rPr>
-        <w:tab/>
-        <w:t>72</w:t>
-      </w:r>
-    </w:p>
-    <w:p>
-      <w:pPr>
-        <w:tabs>
-          <w:tab w:pos="8901" w:val="right" w:leader="dot"/>
-        </w:tabs>
-        <w:spacing w:before="0" w:after="60" w:line="240" w:lineRule="auto"/>
-      </w:pPr>
-      <w:r>
-        <w:rPr>
-          <w:rFonts w:ascii="Times New Roman" w:hAnsi="Times New Roman"/>
-          <w:sz w:val="22"/>
-        </w:rPr>
-        <w:t>Table E.2. Supporting detector confusion counts and runtime</w:t>
-      </w:r>
-      <w:r>
-        <w:rPr>
-          <w:rFonts w:ascii="Times New Roman" w:hAnsi="Times New Roman"/>
-          <w:sz w:val="22"/>
-        </w:rPr>
-        <w:tab/>
-        <w:t>72</w:t>
-      </w:r>
-    </w:p>
-    <w:p>
-      <w:pPr>
-        <w:pStyle w:val="Heading1"/>
-      </w:pPr>
-      <w:r>
-        <w:t>List of Figures</w:t>
-      </w:r>
-    </w:p>
-    <w:p>
-      <w:pPr>
-        <w:tabs>
-          <w:tab w:pos="8901" w:val="right" w:leader="dot"/>
-        </w:tabs>
-        <w:spacing w:before="0" w:after="60" w:line="240" w:lineRule="auto"/>
-      </w:pPr>
-      <w:r>
-        <w:rPr>
-          <w:rFonts w:ascii="Times New Roman" w:hAnsi="Times New Roman"/>
-          <w:sz w:val="22"/>
-        </w:rPr>
-        <w:t>Figure 3.1. CP2 system architecture and evidence boundary</w:t>
-      </w:r>
-      <w:r>
-        <w:rPr>
-          <w:rFonts w:ascii="Times New Roman" w:hAnsi="Times New Roman"/>
-          <w:sz w:val="22"/>
-        </w:rPr>
-        <w:tab/>
-        <w:t>12</w:t>
-      </w:r>
-    </w:p>
-    <w:p>
-      <w:pPr>
-        <w:tabs>
-          <w:tab w:pos="8901" w:val="right" w:leader="dot"/>
-        </w:tabs>
-        <w:spacing w:before="0" w:after="60" w:line="240" w:lineRule="auto"/>
-      </w:pPr>
-      <w:r>
-        <w:rPr>
-          <w:rFonts w:ascii="Times New Roman" w:hAnsi="Times New Roman"/>
-          <w:sz w:val="22"/>
-        </w:rPr>
-        <w:t>Figure 3.2. Unified Alert Queue for operational and research review work</w:t>
-      </w:r>
-      <w:r>
-        <w:rPr>
-          <w:rFonts w:ascii="Times New Roman" w:hAnsi="Times New Roman"/>
-          <w:sz w:val="22"/>
-        </w:rPr>
-        <w:tab/>
-        <w:t>24</w:t>
-      </w:r>
-    </w:p>
-    <w:p>
-      <w:pPr>
-        <w:tabs>
-          <w:tab w:pos="8901" w:val="right" w:leader="dot"/>
-        </w:tabs>
-        <w:spacing w:before="0" w:after="60" w:line="240" w:lineRule="auto"/>
-      </w:pPr>
-      <w:r>
-        <w:rPr>
-          <w:rFonts w:ascii="Times New Roman" w:hAnsi="Times New Roman"/>
-          <w:sz w:val="22"/>
-        </w:rPr>
-        <w:t>Figure 3.3. Case Review evidence brief and bounded local-LLM note</w:t>
-      </w:r>
-      <w:r>
-        <w:rPr>
-          <w:rFonts w:ascii="Times New Roman" w:hAnsi="Times New Roman"/>
-          <w:sz w:val="22"/>
-        </w:rPr>
-        <w:tab/>
-        <w:t>25</w:t>
-      </w:r>
-    </w:p>
-    <w:p>
-      <w:pPr>
-        <w:tabs>
-          <w:tab w:pos="8901" w:val="right" w:leader="dot"/>
-        </w:tabs>
-        <w:spacing w:before="0" w:after="60" w:line="240" w:lineRule="auto"/>
-      </w:pPr>
-      <w:r>
-        <w:rPr>
-          <w:rFonts w:ascii="Times New Roman" w:hAnsi="Times New Roman"/>
-          <w:sz w:val="22"/>
-        </w:rPr>
-        <w:t>Figure 4.1. Detector metric comparison across five seeds</w:t>
-      </w:r>
-      <w:r>
-        <w:rPr>
-          <w:rFonts w:ascii="Times New Roman" w:hAnsi="Times New Roman"/>
-          <w:sz w:val="22"/>
-        </w:rPr>
-        <w:tab/>
-        <w:t>32</w:t>
-      </w:r>
-    </w:p>
-    <w:p>
-      <w:pPr>
-        <w:tabs>
-          <w:tab w:pos="8901" w:val="right" w:leader="dot"/>
-        </w:tabs>
-        <w:spacing w:before="0" w:after="60" w:line="240" w:lineRule="auto"/>
-      </w:pPr>
-      <w:r>
-        <w:rPr>
-          <w:rFonts w:ascii="Times New Roman" w:hAnsi="Times New Roman"/>
-          <w:sz w:val="22"/>
-        </w:rPr>
-        <w:t>Figure 4.2. Seed-42 precision-recall curves</w:t>
-      </w:r>
-      <w:r>
-        <w:rPr>
-          <w:rFonts w:ascii="Times New Roman" w:hAnsi="Times New Roman"/>
-          <w:sz w:val="22"/>
-        </w:rPr>
-        <w:tab/>
-        <w:t>33</w:t>
-      </w:r>
-    </w:p>
-    <w:p>
-      <w:pPr>
-        <w:tabs>
-          <w:tab w:pos="8901" w:val="right" w:leader="dot"/>
-        </w:tabs>
-        <w:spacing w:before="0" w:after="60" w:line="240" w:lineRule="auto"/>
-      </w:pPr>
-      <w:r>
-        <w:rPr>
-          <w:rFonts w:ascii="Times New Roman" w:hAnsi="Times New Roman"/>
-          <w:sz w:val="22"/>
-        </w:rPr>
-        <w:t>Figure 4.3. Global mean absolute SHAP importance</w:t>
-      </w:r>
-      <w:r>
-        <w:rPr>
-          <w:rFonts w:ascii="Times New Roman" w:hAnsi="Times New Roman"/>
-          <w:sz w:val="22"/>
-        </w:rPr>
-        <w:tab/>
-        <w:t>35</w:t>
-      </w:r>
-    </w:p>
-    <w:p>
-      <w:pPr>
-        <w:tabs>
-          <w:tab w:pos="8901" w:val="right" w:leader="dot"/>
-        </w:tabs>
-        <w:spacing w:before="0" w:after="60" w:line="240" w:lineRule="auto"/>
-      </w:pPr>
-      <w:r>
-        <w:rPr>
-          <w:rFonts w:ascii="Times New Roman" w:hAnsi="Times New Roman"/>
-          <w:sz w:val="22"/>
-        </w:rPr>
-        <w:t>Figure 4.4. Narrative violation, fallback, and acceptance rates</w:t>
-      </w:r>
-      <w:r>
-        <w:rPr>
-          <w:rFonts w:ascii="Times New Roman" w:hAnsi="Times New Roman"/>
-          <w:sz w:val="22"/>
-        </w:rPr>
-        <w:tab/>
-        <w:t>37</w:t>
-      </w:r>
-    </w:p>
-    <w:p>
-      <w:pPr>
-        <w:tabs>
-          <w:tab w:pos="8901" w:val="right" w:leader="dot"/>
-        </w:tabs>
-        <w:spacing w:before="0" w:after="60" w:line="240" w:lineRule="auto"/>
-      </w:pPr>
-      <w:r>
-        <w:rPr>
-          <w:rFonts w:ascii="Times New Roman" w:hAnsi="Times New Roman"/>
-          <w:sz w:val="22"/>
-        </w:rPr>
-        <w:t>Figure 4.5. S0 Explanation Assurance with an unlisted-feature mutation</w:t>
-      </w:r>
-      <w:r>
-        <w:rPr>
-          <w:rFonts w:ascii="Times New Roman" w:hAnsi="Times New Roman"/>
-          <w:sz w:val="22"/>
-        </w:rPr>
-        <w:tab/>
-        <w:t>41</w:t>
-      </w:r>
-    </w:p>
-    <w:p>
-      <w:pPr>
-        <w:tabs>
-          <w:tab w:pos="8901" w:val="right" w:leader="dot"/>
-        </w:tabs>
-        <w:spacing w:before="0" w:after="60" w:line="240" w:lineRule="auto"/>
-      </w:pPr>
-      <w:r>
-        <w:rPr>
-          <w:rFonts w:ascii="Times New Roman" w:hAnsi="Times New Roman"/>
-          <w:sz w:val="22"/>
-        </w:rPr>
-        <w:t>Figure 4.6. S0 direction-flip assurance test</w:t>
-      </w:r>
-      <w:r>
-        <w:rPr>
-          <w:rFonts w:ascii="Times New Roman" w:hAnsi="Times New Roman"/>
-          <w:sz w:val="22"/>
-        </w:rPr>
-        <w:tab/>
-        <w:t>42</w:t>
-      </w:r>
-    </w:p>
-    <w:p>
-      <w:pPr>
-        <w:tabs>
-          <w:tab w:pos="8901" w:val="right" w:leader="dot"/>
-        </w:tabs>
-        <w:spacing w:before="0" w:after="60" w:line="240" w:lineRule="auto"/>
-      </w:pPr>
-      <w:r>
-        <w:rPr>
-          <w:rFonts w:ascii="Times New Roman" w:hAnsi="Times New Roman"/>
-          <w:sz w:val="22"/>
-        </w:rPr>
-        <w:t>Figure 4.7. S0 detector metrics on the synthetic operational test period</w:t>
-      </w:r>
-      <w:r>
-        <w:rPr>
-          <w:rFonts w:ascii="Times New Roman" w:hAnsi="Times New Roman"/>
-          <w:sz w:val="22"/>
-        </w:rPr>
-        <w:tab/>
-        <w:t>44</w:t>
-      </w:r>
-    </w:p>
-    <w:p>
-      <w:pPr>
-        <w:tabs>
-          <w:tab w:pos="8901" w:val="right" w:leader="dot"/>
-        </w:tabs>
-        <w:spacing w:before="0" w:after="60" w:line="240" w:lineRule="auto"/>
-      </w:pPr>
-      <w:r>
-        <w:rPr>
-          <w:rFonts w:ascii="Times New Roman" w:hAnsi="Times New Roman"/>
-          <w:sz w:val="22"/>
-        </w:rPr>
-        <w:t>Figure 4.8. S0 explanation assurance outcomes</w:t>
-      </w:r>
-      <w:r>
-        <w:rPr>
-          <w:rFonts w:ascii="Times New Roman" w:hAnsi="Times New Roman"/>
-          <w:sz w:val="22"/>
-        </w:rPr>
-        <w:tab/>
-        <w:t>45</w:t>
-      </w:r>
-    </w:p>
-    <w:p>
-      <w:pPr>
-        <w:tabs>
-          <w:tab w:pos="8901" w:val="right" w:leader="dot"/>
-        </w:tabs>
-        <w:spacing w:before="0" w:after="60" w:line="240" w:lineRule="auto"/>
-      </w:pPr>
-      <w:r>
-        <w:rPr>
-          <w:rFonts w:ascii="Times New Roman" w:hAnsi="Times New Roman"/>
-          <w:sz w:val="22"/>
-        </w:rPr>
-        <w:t>Figure 4.9. Interim human evaluation comprehension and rating outcomes</w:t>
-      </w:r>
-      <w:r>
-        <w:rPr>
-          <w:rFonts w:ascii="Times New Roman" w:hAnsi="Times New Roman"/>
-          <w:sz w:val="22"/>
-        </w:rPr>
-        <w:tab/>
-        <w:t>48</w:t>
-      </w:r>
-    </w:p>
-    <w:p>
-      <w:pPr>
-        <w:tabs>
-          <w:tab w:pos="8901" w:val="right" w:leader="dot"/>
-        </w:tabs>
-        <w:spacing w:before="0" w:after="60" w:line="240" w:lineRule="auto"/>
-      </w:pPr>
-      <w:r>
-        <w:rPr>
-          <w:rFonts w:ascii="Times New Roman" w:hAnsi="Times New Roman"/>
-          <w:sz w:val="22"/>
-        </w:rPr>
-        <w:t>Figure 4.10. Interim human evaluation format preferences</w:t>
-      </w:r>
-      <w:r>
-        <w:rPr>
-          <w:rFonts w:ascii="Times New Roman" w:hAnsi="Times New Roman"/>
-          <w:sz w:val="22"/>
-        </w:rPr>
-        <w:tab/>
-        <w:t>49</w:t>
+        <w:t>50</w:t>
       </w:r>
     </w:p>
     <w:p>
@@ -2446,7 +2446,7 @@
           <w:sz w:val="21"/>
         </w:rPr>
         <w:tab/>
-        <w:t>12</w:t>
+        <w:t>13</w:t>
       </w:r>
     </w:p>
     <w:p>
@@ -2471,7 +2471,7 @@
           <w:sz w:val="21"/>
         </w:rPr>
         <w:tab/>
-        <w:t>12</w:t>
+        <w:t>13</w:t>
       </w:r>
     </w:p>
     <w:p>
@@ -2496,7 +2496,7 @@
           <w:sz w:val="21"/>
         </w:rPr>
         <w:tab/>
-        <w:t>12</w:t>
+        <w:t>13</w:t>
       </w:r>
     </w:p>
     <w:p>
@@ -2521,7 +2521,7 @@
           <w:sz w:val="21"/>
         </w:rPr>
         <w:tab/>
-        <w:t>13</w:t>
+        <w:t>14</w:t>
       </w:r>
     </w:p>
     <w:p>
@@ -2546,7 +2546,7 @@
           <w:sz w:val="21"/>
         </w:rPr>
         <w:tab/>
-        <w:t>14</w:t>
+        <w:t>15</w:t>
       </w:r>
     </w:p>
     <w:p>
@@ -2571,7 +2571,7 @@
           <w:sz w:val="21"/>
         </w:rPr>
         <w:tab/>
-        <w:t>14</w:t>
+        <w:t>15</w:t>
       </w:r>
     </w:p>
     <w:p>
@@ -2596,7 +2596,7 @@
           <w:sz w:val="21"/>
         </w:rPr>
         <w:tab/>
-        <w:t>14</w:t>
+        <w:t>15</w:t>
       </w:r>
     </w:p>
     <w:p>
@@ -2621,7 +2621,7 @@
           <w:sz w:val="21"/>
         </w:rPr>
         <w:tab/>
-        <w:t>15</w:t>
+        <w:t>16</w:t>
       </w:r>
     </w:p>
     <w:p>
@@ -2646,7 +2646,7 @@
           <w:sz w:val="21"/>
         </w:rPr>
         <w:tab/>
-        <w:t>15</w:t>
+        <w:t>16</w:t>
       </w:r>
     </w:p>
     <w:p>
@@ -2671,7 +2671,7 @@
           <w:sz w:val="21"/>
         </w:rPr>
         <w:tab/>
-        <w:t>15</w:t>
+        <w:t>16</w:t>
       </w:r>
     </w:p>
     <w:p>
@@ -2696,7 +2696,7 @@
           <w:sz w:val="21"/>
         </w:rPr>
         <w:tab/>
-        <w:t>15</w:t>
+        <w:t>16</w:t>
       </w:r>
     </w:p>
     <w:p>
@@ -2721,7 +2721,7 @@
           <w:sz w:val="21"/>
         </w:rPr>
         <w:tab/>
-        <w:t>16</w:t>
+        <w:t>17</w:t>
       </w:r>
     </w:p>
     <w:p>
@@ -2746,7 +2746,7 @@
           <w:sz w:val="21"/>
         </w:rPr>
         <w:tab/>
-        <w:t>16</w:t>
+        <w:t>17</w:t>
       </w:r>
     </w:p>
     <w:p>
@@ -2771,7 +2771,7 @@
           <w:sz w:val="21"/>
         </w:rPr>
         <w:tab/>
-        <w:t>17</w:t>
+        <w:t>18</w:t>
       </w:r>
     </w:p>
     <w:p>
@@ -2796,7 +2796,7 @@
           <w:sz w:val="21"/>
         </w:rPr>
         <w:tab/>
-        <w:t>17</w:t>
+        <w:t>18</w:t>
       </w:r>
     </w:p>
     <w:p>
@@ -2821,7 +2821,7 @@
           <w:sz w:val="21"/>
         </w:rPr>
         <w:tab/>
-        <w:t>18</w:t>
+        <w:t>19</w:t>
       </w:r>
     </w:p>
     <w:p>
@@ -2846,7 +2846,7 @@
           <w:sz w:val="21"/>
         </w:rPr>
         <w:tab/>
-        <w:t>18</w:t>
+        <w:t>19</w:t>
       </w:r>
     </w:p>
     <w:p>
@@ -2871,7 +2871,7 @@
           <w:sz w:val="21"/>
         </w:rPr>
         <w:tab/>
-        <w:t>18</w:t>
+        <w:t>19</w:t>
       </w:r>
     </w:p>
     <w:p>
@@ -2896,7 +2896,7 @@
           <w:sz w:val="21"/>
         </w:rPr>
         <w:tab/>
-        <w:t>19</w:t>
+        <w:t>20</w:t>
       </w:r>
     </w:p>
     <w:p>
@@ -2921,7 +2921,7 @@
           <w:sz w:val="21"/>
         </w:rPr>
         <w:tab/>
-        <w:t>19</w:t>
+        <w:t>20</w:t>
       </w:r>
     </w:p>
     <w:p>
@@ -2946,7 +2946,7 @@
           <w:sz w:val="21"/>
         </w:rPr>
         <w:tab/>
-        <w:t>20</w:t>
+        <w:t>21</w:t>
       </w:r>
     </w:p>
     <w:p>
@@ -2971,7 +2971,7 @@
           <w:sz w:val="21"/>
         </w:rPr>
         <w:tab/>
-        <w:t>20</w:t>
+        <w:t>21</w:t>
       </w:r>
     </w:p>
     <w:p>
@@ -2996,7 +2996,7 @@
           <w:sz w:val="21"/>
         </w:rPr>
         <w:tab/>
-        <w:t>20</w:t>
+        <w:t>21</w:t>
       </w:r>
     </w:p>
     <w:p>
@@ -3021,7 +3021,7 @@
           <w:sz w:val="21"/>
         </w:rPr>
         <w:tab/>
-        <w:t>21</w:t>
+        <w:t>22</w:t>
       </w:r>
     </w:p>
     <w:p>
@@ -3046,7 +3046,7 @@
           <w:sz w:val="21"/>
         </w:rPr>
         <w:tab/>
-        <w:t>21</w:t>
+        <w:t>22</w:t>
       </w:r>
     </w:p>
     <w:p>
@@ -3071,7 +3071,7 @@
           <w:sz w:val="21"/>
         </w:rPr>
         <w:tab/>
-        <w:t>22</w:t>
+        <w:t>23</w:t>
       </w:r>
     </w:p>
     <w:p>
@@ -3096,7 +3096,7 @@
           <w:sz w:val="21"/>
         </w:rPr>
         <w:tab/>
-        <w:t>22</w:t>
+        <w:t>23</w:t>
       </w:r>
     </w:p>
     <w:p>
@@ -3121,7 +3121,7 @@
           <w:sz w:val="21"/>
         </w:rPr>
         <w:tab/>
-        <w:t>23</w:t>
+        <w:t>24</w:t>
       </w:r>
     </w:p>
     <w:p>
@@ -3146,7 +3146,7 @@
           <w:sz w:val="21"/>
         </w:rPr>
         <w:tab/>
-        <w:t>23</w:t>
+        <w:t>24</w:t>
       </w:r>
     </w:p>
     <w:p>
@@ -3171,7 +3171,7 @@
           <w:sz w:val="21"/>
         </w:rPr>
         <w:tab/>
-        <w:t>25</w:t>
+        <w:t>26</w:t>
       </w:r>
     </w:p>
     <w:p>
@@ -3196,7 +3196,7 @@
           <w:sz w:val="21"/>
         </w:rPr>
         <w:tab/>
-        <w:t>25</w:t>
+        <w:t>26</w:t>
       </w:r>
     </w:p>
     <w:p>
@@ -3221,7 +3221,7 @@
           <w:sz w:val="21"/>
         </w:rPr>
         <w:tab/>
-        <w:t>28</w:t>
+        <w:t>29</w:t>
       </w:r>
     </w:p>
     <w:p>
@@ -3246,7 +3246,7 @@
           <w:sz w:val="21"/>
         </w:rPr>
         <w:tab/>
-        <w:t>28</w:t>
+        <w:t>29</w:t>
       </w:r>
     </w:p>
     <w:p>
@@ -3271,7 +3271,7 @@
           <w:sz w:val="21"/>
         </w:rPr>
         <w:tab/>
-        <w:t>28</w:t>
+        <w:t>29</w:t>
       </w:r>
     </w:p>
     <w:p>
@@ -3296,7 +3296,7 @@
           <w:sz w:val="21"/>
         </w:rPr>
         <w:tab/>
-        <w:t>29</w:t>
+        <w:t>30</w:t>
       </w:r>
     </w:p>
     <w:p>
@@ -3321,7 +3321,7 @@
           <w:sz w:val="21"/>
         </w:rPr>
         <w:tab/>
-        <w:t>30</w:t>
+        <w:t>31</w:t>
       </w:r>
     </w:p>
     <w:p>
@@ -3346,7 +3346,7 @@
           <w:sz w:val="21"/>
         </w:rPr>
         <w:tab/>
-        <w:t>30</w:t>
+        <w:t>31</w:t>
       </w:r>
     </w:p>
     <w:p>
@@ -3371,7 +3371,7 @@
           <w:sz w:val="21"/>
         </w:rPr>
         <w:tab/>
-        <w:t>30</w:t>
+        <w:t>31</w:t>
       </w:r>
     </w:p>
     <w:p>
@@ -3396,7 +3396,7 @@
           <w:sz w:val="21"/>
         </w:rPr>
         <w:tab/>
-        <w:t>33</w:t>
+        <w:t>34</w:t>
       </w:r>
     </w:p>
     <w:p>
@@ -3421,7 +3421,7 @@
           <w:sz w:val="21"/>
         </w:rPr>
         <w:tab/>
-        <w:t>35</w:t>
+        <w:t>36</w:t>
       </w:r>
     </w:p>
     <w:p>
@@ -3446,7 +3446,7 @@
           <w:sz w:val="21"/>
         </w:rPr>
         <w:tab/>
-        <w:t>36</w:t>
+        <w:t>37</w:t>
       </w:r>
     </w:p>
     <w:p>
@@ -3471,7 +3471,7 @@
           <w:sz w:val="21"/>
         </w:rPr>
         <w:tab/>
-        <w:t>38</w:t>
+        <w:t>40</w:t>
       </w:r>
     </w:p>
     <w:p>
@@ -3496,7 +3496,7 @@
           <w:sz w:val="21"/>
         </w:rPr>
         <w:tab/>
-        <w:t>39</w:t>
+        <w:t>41</w:t>
       </w:r>
     </w:p>
     <w:p>
@@ -3521,7 +3521,7 @@
           <w:sz w:val="21"/>
         </w:rPr>
         <w:tab/>
-        <w:t>43</w:t>
+        <w:t>44</w:t>
       </w:r>
     </w:p>
     <w:p>
@@ -3546,7 +3546,7 @@
           <w:sz w:val="21"/>
         </w:rPr>
         <w:tab/>
-        <w:t>46</w:t>
+        <w:t>47</w:t>
       </w:r>
     </w:p>
     <w:p>
@@ -3571,7 +3571,7 @@
           <w:sz w:val="21"/>
         </w:rPr>
         <w:tab/>
-        <w:t>50</w:t>
+        <w:t>51</w:t>
       </w:r>
     </w:p>
     <w:p>
@@ -3596,7 +3596,7 @@
           <w:sz w:val="21"/>
         </w:rPr>
         <w:tab/>
-        <w:t>50</w:t>
+        <w:t>52</w:t>
       </w:r>
     </w:p>
     <w:p>
@@ -3621,7 +3621,7 @@
           <w:sz w:val="21"/>
         </w:rPr>
         <w:tab/>
-        <w:t>51</w:t>
+        <w:t>52</w:t>
       </w:r>
     </w:p>
     <w:p>
@@ -3646,7 +3646,7 @@
           <w:sz w:val="21"/>
         </w:rPr>
         <w:tab/>
-        <w:t>52</w:t>
+        <w:t>53</w:t>
       </w:r>
     </w:p>
     <w:p>
@@ -3671,7 +3671,7 @@
           <w:sz w:val="21"/>
         </w:rPr>
         <w:tab/>
-        <w:t>52</w:t>
+        <w:t>54</w:t>
       </w:r>
     </w:p>
     <w:p>
@@ -3696,7 +3696,7 @@
           <w:sz w:val="21"/>
         </w:rPr>
         <w:tab/>
-        <w:t>54</w:t>
+        <w:t>55</w:t>
       </w:r>
     </w:p>
     <w:p>
@@ -3721,7 +3721,7 @@
           <w:sz w:val="21"/>
         </w:rPr>
         <w:tab/>
-        <w:t>54</w:t>
+        <w:t>56</w:t>
       </w:r>
     </w:p>
     <w:p>
@@ -3746,7 +3746,7 @@
           <w:sz w:val="21"/>
         </w:rPr>
         <w:tab/>
-        <w:t>57</w:t>
+        <w:t>58</w:t>
       </w:r>
     </w:p>
     <w:p>
@@ -3771,7 +3771,7 @@
           <w:sz w:val="21"/>
         </w:rPr>
         <w:tab/>
-        <w:t>57</w:t>
+        <w:t>58</w:t>
       </w:r>
     </w:p>
     <w:p>
@@ -3796,7 +3796,7 @@
           <w:sz w:val="21"/>
         </w:rPr>
         <w:tab/>
-        <w:t>58</w:t>
+        <w:t>59</w:t>
       </w:r>
     </w:p>
     <w:p>
@@ -3821,7 +3821,7 @@
           <w:sz w:val="21"/>
         </w:rPr>
         <w:tab/>
-        <w:t>59</w:t>
+        <w:t>60</w:t>
       </w:r>
     </w:p>
     <w:p>
@@ -3846,7 +3846,7 @@
           <w:sz w:val="21"/>
         </w:rPr>
         <w:tab/>
-        <w:t>60</w:t>
+        <w:t>61</w:t>
       </w:r>
     </w:p>
     <w:p>
@@ -3871,7 +3871,7 @@
           <w:sz w:val="21"/>
         </w:rPr>
         <w:tab/>
-        <w:t>64</w:t>
+        <w:t>65</w:t>
       </w:r>
     </w:p>
     <w:p>
@@ -3896,7 +3896,7 @@
           <w:sz w:val="21"/>
         </w:rPr>
         <w:tab/>
-        <w:t>66</w:t>
+        <w:t>67</w:t>
       </w:r>
     </w:p>
     <w:p>
@@ -3921,7 +3921,7 @@
           <w:sz w:val="21"/>
         </w:rPr>
         <w:tab/>
-        <w:t>68</w:t>
+        <w:t>69</w:t>
       </w:r>
     </w:p>
     <w:p>
@@ -3946,7 +3946,7 @@
           <w:sz w:val="21"/>
         </w:rPr>
         <w:tab/>
-        <w:t>69</w:t>
+        <w:t>70</w:t>
       </w:r>
     </w:p>
     <w:p>
@@ -3971,7 +3971,7 @@
           <w:sz w:val="21"/>
         </w:rPr>
         <w:tab/>
-        <w:t>69</w:t>
+        <w:t>70</w:t>
       </w:r>
     </w:p>
     <w:p>
@@ -3996,7 +3996,7 @@
           <w:sz w:val="21"/>
         </w:rPr>
         <w:tab/>
-        <w:t>69</w:t>
+        <w:t>70</w:t>
       </w:r>
     </w:p>
     <w:p>
@@ -4021,7 +4021,7 @@
           <w:sz w:val="21"/>
         </w:rPr>
         <w:tab/>
-        <w:t>70</w:t>
+        <w:t>71</w:t>
       </w:r>
     </w:p>
     <w:p>
@@ -4046,7 +4046,7 @@
           <w:sz w:val="21"/>
         </w:rPr>
         <w:tab/>
-        <w:t>70</w:t>
+        <w:t>71</w:t>
       </w:r>
     </w:p>
     <w:p>
@@ -4071,7 +4071,7 @@
           <w:sz w:val="21"/>
         </w:rPr>
         <w:tab/>
-        <w:t>71</w:t>
+        <w:t>72</w:t>
       </w:r>
     </w:p>
     <w:p>
@@ -4096,7 +4096,7 @@
           <w:sz w:val="21"/>
         </w:rPr>
         <w:tab/>
-        <w:t>72</w:t>
+        <w:t>73</w:t>
       </w:r>
     </w:p>
     <w:p>
@@ -5634,6 +5634,11 @@
       <w:pPr>
         <w:spacing w:after="20"/>
       </w:pPr>
+    </w:p>
+    <w:p>
+      <w:r>
+        <w:t>As shown in Table 2.1, the reviewed streams address separate parts of the problem. This project combines them within one evaluation boundary covering detector evidence, constrained narrative generation, deterministic validation, fallback, and separated workflow state.</w:t>
+      </w:r>
     </w:p>
     <w:p>
       <w:r>
@@ -6668,6 +6673,9 @@
     </w:p>
     <w:p>
       <w:r>
+        <w:t xml:space="preserve">Table 2.2 uses </w:t>
+      </w:r>
+      <w:r>
         <w:rPr>
           <w:rFonts w:ascii="Courier New" w:hAnsi="Courier New"/>
           <w:sz w:val="18"/>
@@ -6675,7 +6683,7 @@
         <w:t>Partial</w:t>
       </w:r>
       <w:r>
-        <w:t xml:space="preserve"> has a specific meaning in this comparison. Explingo describes an LLM-grader threshold that can reject a narrative and revert to a graph-based explanation, but the acceptance gate is itself stochastic; its main experiments use GPT-4o through an API, while a smaller local model is examined separately (Zytek et al., 2024). Bello et al. (2025) recommend on-premise execution for sensitive applications, although their reported case studies use GPT-4.5 illustratively and the framework remains conceptual. </w:t>
+        <w:t xml:space="preserve"> in a specific sense. Explingo describes an LLM-grader threshold that can reject a narrative and revert to a graph-based explanation, but the acceptance gate is itself stochastic; its main experiments use GPT-4o through an API, while a smaller local model is examined separately (Zytek et al., 2024). Bello et al. (2025) recommend on-premise execution for sensitive applications, although their reported case studies use GPT-4.5 illustratively and the framework remains conceptual. </w:t>
       </w:r>
       <w:r>
         <w:rPr>
@@ -6764,6 +6772,11 @@
       </w:r>
     </w:p>
     <w:p>
+      <w:r>
+        <w:t>As shown in Figure 3.1, the evidence flow is one-way: immutable detector and explanation artifacts feed the workbench, while analyst changes remain in a separate workflow plane.</w:t>
+      </w:r>
+    </w:p>
+    <w:p>
       <w:pPr>
         <w:pStyle w:val="Heading3"/>
       </w:pPr>
@@ -8422,7 +8435,7 @@
     </w:p>
     <w:p>
       <w:r>
-        <w:t>All groups were executed over seeds 42-46. Only G2 and G6 received a seeded 20-trial random search, having been the strongest untuned groups by validation AP. The other groups retained their predeclared defaults. This tuning asymmetry is reported as a limitation, because cross-group differences cannot be attributed solely to architecture or imbalance mechanism.</w:t>
+        <w:t>As shown in Table 3.1, all groups were executed over seeds 42-46. Only G2 and G6 received a seeded 20-trial random search, having been the strongest untuned groups by validation AP. The other groups retained their predeclared defaults. This tuning asymmetry is reported as a limitation, because cross-group differences cannot be attributed solely to architecture or imbalance mechanism.</w:t>
       </w:r>
     </w:p>
     <w:p>
@@ -9215,7 +9228,7 @@
     </w:p>
     <w:p>
       <w:r>
-        <w:t>This is not an equal-budget architecture comparison. The table makes the development asymmetry explicit, and the resulting cross-group test differences are interpreted descriptively rather than as isolated causal effects of autoencoding, resampling, or class weighting.</w:t>
+        <w:t>Table 3.2 makes clear that this is not an equal-budget architecture comparison. The resulting cross-group test differences are therefore interpreted descriptively rather than as isolated causal effects of autoencoding, resampling, or class weighting.</w:t>
       </w:r>
     </w:p>
     <w:p>
@@ -9662,6 +9675,11 @@
     </w:p>
     <w:p>
       <w:r>
+        <w:t>As shown in Figure 3.2, source badges and within-source rank allow S0 and ULB alerts to appear in one queue without implying that their detector scores share a common scale.</w:t>
+      </w:r>
+    </w:p>
+    <w:p>
+      <w:r>
         <w:t>Operational Case Review places the analyst action controls before the detailed evidence on narrower screens. It reports the frozen threshold, alert rank, readable signed SHAP contributions, coarse value buckets, synthetic amount and timestamp, and narrative delivery status. The page then presents four records side by side: raw SHAP reason codes, the complete deterministic renderer, the Ollama candidate, and the brief actually delivered to the analyst. When validation fails, the rejected candidate remains visible for audit, but the delivered panel shows deterministic fallback.</w:t>
       </w:r>
     </w:p>
@@ -9720,6 +9738,11 @@
       </w:r>
     </w:p>
     <w:p>
+      <w:r>
+        <w:t>Figure 3.3 shows the evidence hierarchy within a case: the SHAP-derived reasons and deterministic brief remain visible alongside the LLM candidate, validator outcome, and analyst-visible delivered output.</w:t>
+      </w:r>
+    </w:p>
+    <w:p>
       <w:pPr>
         <w:pStyle w:val="Heading3"/>
       </w:pPr>
@@ -10997,7 +11020,7 @@
     </w:p>
     <w:p>
       <w:r>
-        <w:t>The S0 detector is a cost-sensitive XGBoost classifier that uses 160 trees, a maximum depth of 4, a learning rate of 0.05, subsample 0.9, column sampling 0.9, and the training-derived class weight. It produces a score for every transaction. The registered configuration selects the 25 highest-scoring test transactions for the explanation comparison. In this frozen run, the detector also flagged exactly 25 transactions at the validation-selected threshold, comprising 18 true positives and 7 false positives. The configured top-25 set is therefore identical to the complete above-threshold set for this run, with no flagged alert truncated and no below-threshold transaction admitted. This equality is a property of the frozen result, not of the general selection rule.</w:t>
+        <w:t>Table 3.3 shows how each readable S0 feature is tied to a current field, past-only history, a static synthetic profile, or delayed label feedback. The S0 detector is a cost-sensitive XGBoost classifier that uses 160 trees, a maximum depth of 4, a learning rate of 0.05, subsample 0.9, column sampling 0.9, and the training-derived class weight. It produces a score for every transaction. The registered configuration selects the 25 highest-scoring test transactions for the explanation comparison. In this frozen run, the detector also flagged exactly 25 transactions at the validation-selected threshold, comprising 18 true positives and 7 false positives. The configured top-25 set is therefore identical to the complete above-threshold set for this run, with no flagged alert truncated and no below-threshold transaction admitted. This equality is a property of the frozen result, not of the general selection rule.</w:t>
       </w:r>
     </w:p>
     <w:p>
@@ -11950,7 +11973,7 @@
         <w:jc w:val="left"/>
       </w:pPr>
       <w:r>
-        <w:t xml:space="preserve">The dataset SHA-256 was </w:t>
+        <w:t xml:space="preserve">As shown in Table 4.1, the seed-42 split preserved approximately the same fraud prevalence after deduplication across the training, validation, and test partitions. The dataset SHA-256 was </w:t>
       </w:r>
       <w:r>
         <w:rPr>
@@ -13169,7 +13192,7 @@
     </w:p>
     <w:p>
       <w:r>
-        <w:t>G2 exceeded G0 by only 0.000816 in mean AP, which gives little evidence that reconstruction error materially improved discrimination. G3 fell 0.036021 below G0 and had the largest standard deviation, indicating lower and less stable performance under the reconstruction-error plus SMOTE configuration. G7 came close to the leading AP groups but did not establish a clear hybrid advantage.</w:t>
+        <w:t>As shown in Table 4.2, G2 exceeded G0 by only 0.000816 in mean AP, which gives little evidence that reconstruction error materially improved discrimination. G3 fell 0.036021 below G0 and had the largest standard deviation, indicating lower and less stable performance under the reconstruction-error plus SMOTE configuration. G7 came close to the leading AP groups but did not establish a clear hybrid advantage.</w:t>
       </w:r>
     </w:p>
     <w:p>
@@ -13233,7 +13256,7 @@
     </w:p>
     <w:p>
       <w:r>
-        <w:t>Ranked-alert and runtime measures were recorded for every run. Across the six groups, mean Precision@100 ranged from 0.598 to 0.606 and mean Recall@100 from 0.842 to 0.854. Appendix E reports the per-group mean and sample standard deviation for ROC-AUC, Precision@100, Recall@100, confusion counts, training time, and test inference time. Seed-level results and manifest identifiers remain available in full in the electronic project repository.</w:t>
+        <w:t>Figure 4.1 shows that no detector dominated every operational measure: G6 reduced false-positive review burden, whereas G7 reduced missed fraud at the reported thresholds. Ranked-alert and runtime measures were also recorded for every run. Across the six groups, mean Precision@100 ranged from 0.598 to 0.606 and mean Recall@100 from 0.842 to 0.854. Appendix E reports the per-group mean and sample standard deviation for ROC-AUC, Precision@100, Recall@100, confusion counts, training time, and test inference time. Seed-level results and manifest identifiers remain available in full in the electronic project repository.</w:t>
       </w:r>
     </w:p>
     <w:p>
@@ -14021,7 +14044,7 @@
     </w:p>
     <w:p>
       <w:r>
-        <w:t>G4 generated one local reason-code record for each flagged case. In the separate 2,000-row global explanation sample, mean absolute SHAP importance ranked V14, V4, V12, V3, and V11 as the five highest features. V14 also ranked first in each of the 51 flagged-case evidence packages and appeared as an increasing-risk contribution in 50 of them. V10 appeared in 49 packages and V12 in 44, and 42 of the 51 packages contained the same V14, V10, and V12 trio in one of two rank orders. The repeated anonymous reason-code patterns are therefore a property of the frozen detector's concentrated attribution pattern on this dataset rather than an artefact introduced by the workbench interface. SHAP remains a non-causal model-attribution method, and the anonymised feature identifiers limit direct business interpretation.</w:t>
+        <w:t>Table 4.3 records the frozen operating point and its resulting confusion counts. G4 generated one local reason-code record for each of the 51 flagged cases. In the separate 2,000-row global explanation sample, mean absolute SHAP importance ranked V14, V4, V12, V3, and V11 as the five highest features. V14 also ranked first in each of the 51 flagged-case evidence packages and appeared as an increasing-risk contribution in 50 of them. V10 appeared in 49 packages and V12 in 44, and 42 of the 51 packages contained the same V14, V10, and V12 trio in one of two rank orders. The repeated anonymous reason-code patterns are therefore a property of the frozen detector's concentrated attribution pattern on this dataset rather than an artefact introduced by the workbench interface. SHAP remains a non-causal model-attribution method, and the anonymised feature identifiers limit direct business interpretation.</w:t>
       </w:r>
     </w:p>
     <w:p>
@@ -14074,6 +14097,11 @@
       </w:r>
     </w:p>
     <w:p>
+      <w:r>
+        <w:t>As shown in Figure 4.3, V14 has the largest global mean absolute SHAP importance, which helps explain why many flagged cases contain similar V14-led reason-code patterns.</w:t>
+      </w:r>
+    </w:p>
+    <w:p>
       <w:pPr>
         <w:pStyle w:val="Heading2"/>
       </w:pPr>
@@ -14791,7 +14819,7 @@
     </w:p>
     <w:p>
       <w:r>
-        <w:t>These results are deliberately restricted to the synthetic corpus. A separate adversarial test constructed faithful English paraphrases that fell outside the accepted phrase grammar, and the validator rejected them. The calibration result therefore demonstrates consistency within a defined language contract, not universal natural-language understanding.</w:t>
+        <w:t>As shown in Table 4.4, the validator intercepted all versioned attacks and accepted all faithful controls within the calibration corpus. These results are deliberately restricted to that synthetic corpus. A separate adversarial test constructed faithful English paraphrases that fell outside the accepted phrase grammar, and the validator rejected them. The calibration result therefore demonstrates consistency within a defined language contract, not universal natural-language understanding.</w:t>
       </w:r>
     </w:p>
     <w:p>
@@ -16049,7 +16077,7 @@
     </w:p>
     <w:p>
       <w:r>
-        <w:t>The per-check rows are not additive and should not be read as separate error prevalences. In the strict arm, the same two outputs failed format, grounding, and direction while retaining complete evidence bullets. In the simple arm, all 51 candidates failed the required full structure and so could not be accepted by the grounding or direction parsers, although 49 still preserved the complete ordered evidence list. The 100% direction-check failure therefore does not mean that every simple narrative semantically reversed a SHAP direction; it means that none satisfied the validator's complete accepted direction contract.</w:t>
+        <w:t>As shown in Table 4.5, the per-check rows are not additive and should not be read as separate error prevalences. In the strict arm, the same two outputs failed format, grounding, and direction while retaining complete evidence bullets. In the simple arm, all 51 candidates failed the required full structure and so could not be accepted by the grounding or direction parsers, although 49 still preserved the complete ordered evidence list. The 100% direction-check failure therefore does not mean that every simple narrative semantically reversed a SHAP direction; it means that none satisfied the validator's complete accepted direction contract.</w:t>
       </w:r>
     </w:p>
     <w:p>
@@ -16108,7 +16136,7 @@
     </w:p>
     <w:p>
       <w:r>
-        <w:t>The strict-versus-simple comparison indicates that stronger prompt constraints changed deliverability for this model, prompt pair, evidence format, and 51-case set. It does not establish that strict prompting is generally superior across LLMs or tasks. The simple arm is a negative experimental result, not a usable delivery configuration.</w:t>
+        <w:t>As shown in Figure 4.4, stronger prompt constraints changed deliverability for this model, prompt pair, evidence format, and 51-case set. This does not establish that strict prompting is generally superior across LLMs or tasks. The simple arm is a negative experimental result, not a usable delivery configuration.</w:t>
       </w:r>
     </w:p>
     <w:p>
@@ -16343,7 +16371,7 @@
     </w:p>
     <w:p>
       <w:r>
-        <w:t>The controlled mutations include a direction flip, an unlisted feature, and template corruption. In the direction-flip scenario, the altered direction for Terminal distance from customer home fails only the direction check. The system rejects the candidate and displays the fallback that would reach the analyst. The test leaves the recorded S0 evidence and delivered brief unchanged.</w:t>
+        <w:t>Figure 4.5 shows that an unlisted-feature mutation fails grounding and activates fallback without changing the recorded case. The controlled mutations also include a direction flip and template corruption. In the direction-flip scenario, the altered direction for Terminal distance from customer home fails only the direction check. The system rejects the candidate and displays the fallback that would reach the analyst. The test leaves the recorded S0 evidence and delivered brief unchanged.</w:t>
       </w:r>
     </w:p>
     <w:p>
@@ -16397,7 +16425,7 @@
     </w:p>
     <w:p>
       <w:r>
-        <w:t>Verification outcomes are recorded in Appendix B.</w:t>
+        <w:t>As shown in Figure 4.6, the direction-flip mutation isolates the direction check while the other three checks remain passing. Verification outcomes are recorded in Appendix B.</w:t>
       </w:r>
     </w:p>
     <w:p>
@@ -17299,7 +17327,7 @@
     </w:p>
     <w:p>
       <w:r>
-        <w:t>The S0 detector applied the validation-selected threshold 0.972929. Over the frozen test period it produced 18 true positives, 7 false positives, 27 false negatives, and 7,448 true negatives. Test AP was 0.544017, ROC-AUC was 0.960945, precision was 0.720000, recall was 0.400000, and F1 was 0.514286. These values describe the synthetic stream only. They are not directly comparable with the ULB benchmark because the data-generating process, feature space, prevalence, and split design all differ.</w:t>
+        <w:t>As shown in Table 4.6, the chronological test period contained 7,500 transactions and 45 fraud cases, with a lower observed fraud prevalence than the training period. The S0 detector applied the validation-selected threshold 0.972929. Over the frozen test period it produced 18 true positives, 7 false positives, 27 false negatives, and 7,448 true negatives. Test AP was 0.544017, ROC-AUC was 0.960945, precision was 0.720000, recall was 0.400000, and F1 was 0.514286. These values describe the synthetic stream only. They are not directly comparable with the ULB benchmark because the data-generating process, feature space, prevalence, and split design all differ.</w:t>
       </w:r>
     </w:p>
     <w:p>
@@ -18069,7 +18097,7 @@
     </w:p>
     <w:p>
       <w:r>
-        <w:t>The explanation comparison covered the 25 highest-scoring S0 test transactions, which in this frozen run are exactly the 25 above-threshold alerts. Their relative review-priority distribution was 7 High, 7 Medium, and 11 Low. These labels subdivide only the already-flagged score range and do not represent calibrated fraud probabilities. Each alert carried three ranked evidence items. Amount relative to the customer's 30-day average and terminal distance from the customer home profile appeared in all 25 evidence packages, night-time status in 14, transaction amount in 10, and delayed terminal fraud risk in one.</w:t>
+        <w:t>Table 4.7 and Figure 4.7 show that the S0 operating point favoured precision over recall, producing 18 true positives and 7 false positives while leaving 27 fraud cases below threshold. The explanation comparison covered the 25 highest-scoring S0 test transactions, which in this frozen run are exactly the 25 above-threshold alerts. Their relative review-priority distribution was 7 High, 7 Medium, and 11 Low. These labels subdivide only the already-flagged score range and do not represent calibrated fraud probabilities. Each alert carried three ranked evidence items. Amount relative to the customer's 30-day average and terminal distance from the customer home profile appeared in all 25 evidence packages, night-time status in 14, transaction amount in 10, and delayed terminal fraud risk in one.</w:t>
       </w:r>
     </w:p>
     <w:p>
@@ -18960,7 +18988,7 @@
     </w:p>
     <w:p>
       <w:r>
-        <w:t xml:space="preserve">The guarded LLM passed validation for 23/25 briefs and activated deterministic fallback for 2/25. Both rejected candidates returned only one structured evidence item, even though the minimised payload contained three ranked items, and both copied the rank-one evidence value bucket, </w:t>
+        <w:t xml:space="preserve">As shown in Table 4.8 and Figure 4.8, the guarded LLM passed validation for 23/25 briefs and activated deterministic fallback for 2/25. Both rejected candidates returned only one structured evidence item, even though the minimised payload contained three ranked items, and both copied the rank-one evidence value bucket, </w:t>
       </w:r>
       <w:r>
         <w:rPr>
@@ -19628,7 +19656,7 @@
     </w:p>
     <w:p>
       <w:r>
-        <w:t>These artifact-level measurements describe the delivered text; human comprehension and preference are examined separately in Section 4.8.</w:t>
+        <w:t>As shown in Table 4.9, the accepted guarded-LLM summaries were shorter and less varied than the deterministic briefs and named one rather than three evidence items on average. These artifact-level measurements describe the delivered text; human comprehension and preference are examined separately in Section 4.8.</w:t>
       </w:r>
     </w:p>
     <w:p>
@@ -20785,6 +20813,11 @@
       <w:pPr>
         <w:spacing w:after="20"/>
       </w:pPr>
+    </w:p>
+    <w:p>
+      <w:r>
+        <w:t>As shown in Table 4.10, the sample was dominated by participants with computing or IT backgrounds and basic fraud-domain familiarity, so it should not be treated as a practising-analyst sample.</w:t>
+      </w:r>
     </w:p>
     <w:p>
       <w:r>
@@ -21363,6 +21396,11 @@
     </w:p>
     <w:p>
       <w:r>
+        <w:t>Table 4.11 shows overlapping observed accuracy ranges across the three formats, with no comprehension check led by the guarded LLM brief.</w:t>
+      </w:r>
+    </w:p>
+    <w:p>
+      <w:r>
         <w:t>Table 4.12 reports the five-point rating items as medians with interquartile ranges. Higher values are more favourable for clarity, confidence, and evidence sufficiency; for mental effort a higher value indicates more effort and is therefore less favourable.</w:t>
       </w:r>
     </w:p>
@@ -22068,6 +22106,11 @@
       <w:pPr>
         <w:spacing w:after="20"/>
       </w:pPr>
+    </w:p>
+    <w:p>
+      <w:r>
+        <w:t>As shown in Table 4.12, median clarity was 4 for every format, while confidence and mental-effort medians were 3 across all three formats.</w:t>
+      </w:r>
     </w:p>
     <w:p>
       <w:r>
@@ -22777,7 +22820,7 @@
     </w:p>
     <w:p>
       <w:r>
-        <w:t>Participants also recorded a provisional routing action for each case. Because the workflow was blind to retrospective ground truth, these actions are workflow observations rather than correctness measures and are not scored here.</w:t>
+        <w:t>Table 4.13 shows that perceived clarity and first-pass preference favoured the guarded LLM brief, whereas trust favoured the deterministic brief. Participants also recorded a provisional routing action for each case. Because the workflow was blind to retrospective ground truth, these actions are workflow observations rather than correctness measures and are not scored here.</w:t>
       </w:r>
     </w:p>
     <w:p>
@@ -22880,7 +22923,7 @@
     </w:p>
     <w:p>
       <w:r>
-        <w:t>The results show a trade-off rather than a single winning format. All nine accuracy estimates fell between 72.73% and 90.91%, and the intervals overlapped across formats. The deterministic brief had the highest observed accuracy for identifying the leading evidence item, raw reason codes the highest for evidence count, and the guarded LLM brief the lowest point estimate on all three checks. Median clarity was 4 for every format, but only the guarded LLM brief had an interquartile range of [4, 4]. The deterministic brief was the only format with a median of 4 for evidence sufficiency, while confidence and mental-effort medians were 3 for all three formats. Seven participants selected the guarded LLM brief as clearest and seven selected it for first-pass review, whereas six selected the deterministic brief as most trustworthy.</w:t>
+        <w:t>Figures 4.9 and 4.10 summarise a trade-off rather than a single winning format. All nine accuracy estimates fell between 72.73% and 90.91%, and the intervals overlapped across formats. The deterministic brief had the highest observed accuracy for identifying the leading evidence item, raw reason codes the highest for evidence count, and the guarded LLM brief the lowest point estimate on all three checks. Median clarity was 4 for every format, but only the guarded LLM brief had an interquartile range of [4, 4]. The deterministic brief was the only format with a median of 4 for evidence sufficiency, while confidence and mental-effort medians were 3 for all three formats. Seven participants selected the guarded LLM brief as clearest and seven selected it for first-pass review, whereas six selected the deterministic brief as most trustworthy.</w:t>
       </w:r>
     </w:p>
     <w:p>
@@ -23143,7 +23186,7 @@
     </w:p>
     <w:p>
       <w:r>
-        <w:t>The human evidence supporting RQ2 is interim and descriptive. Recruitment did not reach the pre-specified minimum of 18, no inferential test was run, and explanation format is confounded with case content and presentation order. The RQ2 result records what was observed under these conditions rather than a comparative ranking.</w:t>
+        <w:t>As shown in Table 4.14, RQ1 is supported only within the tested validation and fallback contracts, while RQ2 records a bounded negative result for added detail and measured comprehension. The human evidence supporting RQ2 is interim and descriptive. Recruitment did not reach the pre-specified minimum of 18, no inferential test was run, and explanation format is confounded with case content and presentation order. The RQ2 result records what was observed under these conditions rather than a comparative ranking.</w:t>
       </w:r>
     </w:p>
     <w:p>
@@ -24143,6 +24186,11 @@
       </w:pPr>
     </w:p>
     <w:p>
+      <w:r>
+        <w:t>As shown in Table 5.1, five objectives were met within their stated evidence boundaries, while the explanation-format comparison remained partially met because the human evaluation was interim and confounded.</w:t>
+      </w:r>
+    </w:p>
+    <w:p>
       <w:pPr>
         <w:pStyle w:val="Heading2"/>
       </w:pPr>
@@ -26784,6 +26832,11 @@
       </w:pPr>
     </w:p>
     <w:p>
+      <w:r>
+        <w:t>Table A.1 shows that each reported claim is paired with primary evidence and an explicit interpretation boundary.</w:t>
+      </w:r>
+    </w:p>
+    <w:p>
       <w:pPr>
         <w:pStyle w:val="Heading1"/>
       </w:pPr>
@@ -28125,7 +28178,7 @@
         <w:jc w:val="left"/>
       </w:pPr>
       <w:r>
-        <w:t xml:space="preserve">The source dataset hash is </w:t>
+        <w:t xml:space="preserve">Table B.1 summarises the implemented software and the artifact types retained for reproducibility. The source dataset hash is </w:t>
       </w:r>
       <w:r>
         <w:rPr>
@@ -30119,6 +30172,11 @@
       <w:pPr>
         <w:spacing w:after="20"/>
       </w:pPr>
+    </w:p>
+    <w:p>
+      <w:r>
+        <w:t>As shown in Table E.1, the six groups produced closely clustered ranked-alert metrics, with mean Precision@100 between 0.598 and 0.606 and mean Recall@100 between 0.842 and 0.854.</w:t>
+      </w:r>
     </w:p>
     <w:p>
       <w:pPr>
@@ -31765,7 +31823,7 @@
     </w:p>
     <w:p>
       <w:r>
-        <w:t>The confusion counts reflect each seed's validation-selected threshold rather than a common test threshold. Runtime was measured on the project machine and is reported for reproducibility, not as a hardware-independent performance benchmark.</w:t>
+        <w:t>As shown in Table E.2, the confusion counts reflect each seed's validation-selected threshold rather than a common test threshold. Runtime was measured on the project machine and is reported for reproducibility, not as a hardware-independent performance benchmark.</w:t>
       </w:r>
     </w:p>
     <w:sectPr>

</xml_diff>

<commit_message>
Vary academic table and figure references
</commit_message>
<xml_diff>
--- a/reports/thesis/submission/CP2_Final_Report_Ng_Yi_Zhen.docx
+++ b/reports/thesis/submission/CP2_Final_Report_Ng_Yi_Zhen.docx
@@ -3596,7 +3596,7 @@
           <w:sz w:val="21"/>
         </w:rPr>
         <w:tab/>
-        <w:t>52</w:t>
+        <w:t>51</w:t>
       </w:r>
     </w:p>
     <w:p>
@@ -5637,7 +5637,7 @@
     </w:p>
     <w:p>
       <w:r>
-        <w:t>As shown in Table 2.1, the reviewed streams address separate parts of the problem. This project combines them within one evaluation boundary covering detector evidence, constrained narrative generation, deterministic validation, fallback, and separated workflow state.</w:t>
+        <w:t>The comparison in Table 2.1 indicates that the reviewed streams address separate parts of the problem. This project combines them within one evaluation boundary covering detector evidence, constrained narrative generation, deterministic validation, fallback, and separated workflow state.</w:t>
       </w:r>
     </w:p>
     <w:p>
@@ -6773,7 +6773,7 @@
     </w:p>
     <w:p>
       <w:r>
-        <w:t>As shown in Figure 3.1, the evidence flow is one-way: immutable detector and explanation artifacts feed the workbench, while analyst changes remain in a separate workflow plane.</w:t>
+        <w:t>Figure 3.1 depicts a one-way evidence flow: immutable detector and explanation artifacts feed the workbench, while analyst changes remain in a separate workflow plane.</w:t>
       </w:r>
     </w:p>
     <w:p>
@@ -8435,7 +8435,7 @@
     </w:p>
     <w:p>
       <w:r>
-        <w:t>As shown in Table 3.1, all groups were executed over seeds 42-46. Only G2 and G6 received a seeded 20-trial random search, having been the strongest untuned groups by validation AP. The other groups retained their predeclared defaults. This tuning asymmetry is reported as a limitation, because cross-group differences cannot be attributed solely to architecture or imbalance mechanism.</w:t>
+        <w:t>The configuration summary in Table 3.1 confirms that all groups were executed over seeds 42-46. Only G2 and G6 received a seeded 20-trial random search, having been the strongest untuned groups by validation AP. The other groups retained their predeclared defaults. This tuning asymmetry is reported as a limitation, because cross-group differences cannot be attributed solely to architecture or imbalance mechanism.</w:t>
       </w:r>
     </w:p>
     <w:p>
@@ -9675,7 +9675,7 @@
     </w:p>
     <w:p>
       <w:r>
-        <w:t>As shown in Figure 3.2, source badges and within-source rank allow S0 and ULB alerts to appear in one queue without implying that their detector scores share a common scale.</w:t>
+        <w:t>In Figure 3.2, source badges and within-source rank allow S0 and ULB alerts to appear in one queue without implying that their detector scores share a common scale.</w:t>
       </w:r>
     </w:p>
     <w:p>
@@ -11973,7 +11973,7 @@
         <w:jc w:val="left"/>
       </w:pPr>
       <w:r>
-        <w:t xml:space="preserve">As shown in Table 4.1, the seed-42 split preserved approximately the same fraud prevalence after deduplication across the training, validation, and test partitions. The dataset SHA-256 was </w:t>
+        <w:t xml:space="preserve">The split counts in Table 4.1 confirm that the seed-42 partitions preserved approximately the same fraud prevalence after deduplication. The dataset SHA-256 was </w:t>
       </w:r>
       <w:r>
         <w:rPr>
@@ -13192,7 +13192,7 @@
     </w:p>
     <w:p>
       <w:r>
-        <w:t>As shown in Table 4.2, G2 exceeded G0 by only 0.000816 in mean AP, which gives little evidence that reconstruction error materially improved discrimination. G3 fell 0.036021 below G0 and had the largest standard deviation, indicating lower and less stable performance under the reconstruction-error plus SMOTE configuration. G7 came close to the leading AP groups but did not establish a clear hybrid advantage.</w:t>
+        <w:t>The five-seed results in Table 4.2 indicate that G2 exceeded G0 by only 0.000816 in mean AP, which gives little evidence that reconstruction error materially improved discrimination. G3 fell 0.036021 below G0 and had the largest standard deviation, indicating lower and less stable performance under the reconstruction-error plus SMOTE configuration. G7 came close to the leading AP groups but did not establish a clear hybrid advantage.</w:t>
       </w:r>
     </w:p>
     <w:p>
@@ -14098,7 +14098,7 @@
     </w:p>
     <w:p>
       <w:r>
-        <w:t>As shown in Figure 4.3, V14 has the largest global mean absolute SHAP importance, which helps explain why many flagged cases contain similar V14-led reason-code patterns.</w:t>
+        <w:t>Figure 4.3 highlights the dominant global mean absolute SHAP importance of V14, helping to explain why many flagged cases contain similar V14-led reason-code patterns.</w:t>
       </w:r>
     </w:p>
     <w:p>
@@ -14819,7 +14819,7 @@
     </w:p>
     <w:p>
       <w:r>
-        <w:t>As shown in Table 4.4, the validator intercepted all versioned attacks and accepted all faithful controls within the calibration corpus. These results are deliberately restricted to that synthetic corpus. A separate adversarial test constructed faithful English paraphrases that fell outside the accepted phrase grammar, and the validator rejected them. The calibration result therefore demonstrates consistency within a defined language contract, not universal natural-language understanding.</w:t>
+        <w:t>The calibration outcomes in Table 4.4 indicate that the validator intercepted all versioned attacks and accepted all faithful controls within the corpus. These results are deliberately restricted to that synthetic corpus. A separate adversarial test constructed faithful English paraphrases that fell outside the accepted phrase grammar, and the validator rejected them. The calibration result therefore demonstrates consistency within a defined language contract, not universal natural-language understanding.</w:t>
       </w:r>
     </w:p>
     <w:p>
@@ -16077,7 +16077,7 @@
     </w:p>
     <w:p>
       <w:r>
-        <w:t>As shown in Table 4.5, the per-check rows are not additive and should not be read as separate error prevalences. In the strict arm, the same two outputs failed format, grounding, and direction while retaining complete evidence bullets. In the simple arm, all 51 candidates failed the required full structure and so could not be accepted by the grounding or direction parsers, although 49 still preserved the complete ordered evidence list. The 100% direction-check failure therefore does not mean that every simple narrative semantically reversed a SHAP direction; it means that none satisfied the validator's complete accepted direction contract.</w:t>
+        <w:t>The check-level breakdown in Table 4.5 is not additive and should not be read as a set of separate error prevalences. In the strict arm, the same two outputs failed format, grounding, and direction while retaining complete evidence bullets. In the simple arm, all 51 candidates failed the required full structure and so could not be accepted by the grounding or direction parsers, although 49 still preserved the complete ordered evidence list. The 100% direction-check failure therefore does not mean that every simple narrative semantically reversed a SHAP direction; it means that none satisfied the validator's complete accepted direction contract.</w:t>
       </w:r>
     </w:p>
     <w:p>
@@ -16136,7 +16136,7 @@
     </w:p>
     <w:p>
       <w:r>
-        <w:t>As shown in Figure 4.4, stronger prompt constraints changed deliverability for this model, prompt pair, evidence format, and 51-case set. This does not establish that strict prompting is generally superior across LLMs or tasks. The simple arm is a negative experimental result, not a usable delivery configuration.</w:t>
+        <w:t>The contrast in Figure 4.4 indicates that stronger prompt constraints changed deliverability for this model, prompt pair, evidence format, and 51-case set. This does not establish that strict prompting is generally superior across LLMs or tasks. The simple arm is a negative experimental result, not a usable delivery configuration.</w:t>
       </w:r>
     </w:p>
     <w:p>
@@ -16425,7 +16425,7 @@
     </w:p>
     <w:p>
       <w:r>
-        <w:t>As shown in Figure 4.6, the direction-flip mutation isolates the direction check while the other three checks remain passing. Verification outcomes are recorded in Appendix B.</w:t>
+        <w:t>Figure 4.6 isolates the direction check: the direction-flip mutation fails that check while the other three remain passing. Verification outcomes are recorded in Appendix B.</w:t>
       </w:r>
     </w:p>
     <w:p>
@@ -17327,7 +17327,7 @@
     </w:p>
     <w:p>
       <w:r>
-        <w:t>As shown in Table 4.6, the chronological test period contained 7,500 transactions and 45 fraud cases, with a lower observed fraud prevalence than the training period. The S0 detector applied the validation-selected threshold 0.972929. Over the frozen test period it produced 18 true positives, 7 false positives, 27 false negatives, and 7,448 true negatives. Test AP was 0.544017, ROC-AUC was 0.960945, precision was 0.720000, recall was 0.400000, and F1 was 0.514286. These values describe the synthetic stream only. They are not directly comparable with the ULB benchmark because the data-generating process, feature space, prevalence, and split design all differ.</w:t>
+        <w:t>Table 4.6 records 7,500 transactions and 45 fraud cases in the chronological test period, with a lower observed fraud prevalence than in training. The S0 detector applied the validation-selected threshold 0.972929. Over the frozen test period it produced 18 true positives, 7 false positives, 27 false negatives, and 7,448 true negatives. Test AP was 0.544017, ROC-AUC was 0.960945, precision was 0.720000, recall was 0.400000, and F1 was 0.514286. These values describe the synthetic stream only. They are not directly comparable with the ULB benchmark because the data-generating process, feature space, prevalence, and split design all differ.</w:t>
       </w:r>
     </w:p>
     <w:p>
@@ -18988,7 +18988,7 @@
     </w:p>
     <w:p>
       <w:r>
-        <w:t xml:space="preserve">As shown in Table 4.8 and Figure 4.8, the guarded LLM passed validation for 23/25 briefs and activated deterministic fallback for 2/25. Both rejected candidates returned only one structured evidence item, even though the minimised payload contained three ranked items, and both copied the rank-one evidence value bucket, </w:t>
+        <w:t xml:space="preserve">Taken together, Table 4.8 and Figure 4.8 show that the guarded LLM passed validation for 23/25 briefs and activated deterministic fallback for 2/25. Both rejected candidates returned only one structured evidence item, even though the minimised payload contained three ranked items, and both copied the rank-one evidence value bucket, </w:t>
       </w:r>
       <w:r>
         <w:rPr>
@@ -19656,7 +19656,7 @@
     </w:p>
     <w:p>
       <w:r>
-        <w:t>As shown in Table 4.9, the accepted guarded-LLM summaries were shorter and less varied than the deterministic briefs and named one rather than three evidence items on average. These artifact-level measurements describe the delivered text; human comprehension and preference are examined separately in Section 4.8.</w:t>
+        <w:t>The artifact comparison in Table 4.9 indicates that the accepted guarded-LLM summaries were shorter and less varied than the deterministic briefs and named one rather than three evidence items on average. These measurements describe the delivered text; human comprehension and preference are examined separately in Section 4.8.</w:t>
       </w:r>
     </w:p>
     <w:p>
@@ -20816,7 +20816,7 @@
     </w:p>
     <w:p>
       <w:r>
-        <w:t>As shown in Table 4.10, the sample was dominated by participants with computing or IT backgrounds and basic fraud-domain familiarity, so it should not be treated as a practising-analyst sample.</w:t>
+        <w:t>The participant profile in Table 4.10 is dominated by computing or IT backgrounds and basic fraud-domain familiarity; it should therefore not be treated as a practising-analyst sample.</w:t>
       </w:r>
     </w:p>
     <w:p>
@@ -22109,7 +22109,7 @@
     </w:p>
     <w:p>
       <w:r>
-        <w:t>As shown in Table 4.12, median clarity was 4 for every format, while confidence and mental-effort medians were 3 across all three formats.</w:t>
+        <w:t>Table 4.12 reports a median clarity score of 4 for every format, while confidence and mental-effort medians were 3 across all three formats.</w:t>
       </w:r>
     </w:p>
     <w:p>
@@ -23186,7 +23186,7 @@
     </w:p>
     <w:p>
       <w:r>
-        <w:t>As shown in Table 4.14, RQ1 is supported only within the tested validation and fallback contracts, while RQ2 records a bounded negative result for added detail and measured comprehension. The human evidence supporting RQ2 is interim and descriptive. Recruitment did not reach the pre-specified minimum of 18, no inferential test was run, and explanation format is confounded with case content and presentation order. The RQ2 result records what was observed under these conditions rather than a comparative ranking.</w:t>
+        <w:t>The synthesis in Table 4.14 limits support for RQ1 to the tested validation and fallback contracts, while RQ2 records a bounded negative result for added detail and measured comprehension. The human evidence supporting RQ2 is interim and descriptive. Recruitment did not reach the pre-specified minimum of 18, no inferential test was run, and explanation format is confounded with case content and presentation order. The RQ2 result records what was observed under these conditions rather than a comparative ranking.</w:t>
       </w:r>
     </w:p>
     <w:p>
@@ -24187,7 +24187,7 @@
     </w:p>
     <w:p>
       <w:r>
-        <w:t>As shown in Table 5.1, five objectives were met within their stated evidence boundaries, while the explanation-format comparison remained partially met because the human evaluation was interim and confounded.</w:t>
+        <w:t>Table 5.1 records five objectives as met within their stated evidence boundaries. The explanation-format comparison remained partially met because the human evaluation was interim and confounded.</w:t>
       </w:r>
     </w:p>
     <w:p>
@@ -30175,7 +30175,7 @@
     </w:p>
     <w:p>
       <w:r>
-        <w:t>As shown in Table E.1, the six groups produced closely clustered ranked-alert metrics, with mean Precision@100 between 0.598 and 0.606 and mean Recall@100 between 0.842 and 0.854.</w:t>
+        <w:t>The supporting results in Table E.1 place the six groups within a narrow range of ranked-alert performance, with mean Precision@100 between 0.598 and 0.606 and mean Recall@100 between 0.842 and 0.854.</w:t>
       </w:r>
     </w:p>
     <w:p>
@@ -31823,7 +31823,7 @@
     </w:p>
     <w:p>
       <w:r>
-        <w:t>As shown in Table E.2, the confusion counts reflect each seed's validation-selected threshold rather than a common test threshold. Runtime was measured on the project machine and is reported for reproducibility, not as a hardware-independent performance benchmark.</w:t>
+        <w:t>Table E.2 reports confusion counts at each seed's validation-selected threshold rather than at a common test threshold. Runtime was measured on the project machine and is included for reproducibility, not as a hardware-independent performance benchmark.</w:t>
       </w:r>
     </w:p>
     <w:sectPr>

</xml_diff>

<commit_message>
Revise abstract to supervisor guidance
</commit_message>
<xml_diff>
--- a/reports/thesis/submission/CP2_Final_Report_Ng_Yi_Zhen.docx
+++ b/reports/thesis/submission/CP2_Final_Report_Ng_Yi_Zhen.docx
@@ -262,27 +262,22 @@
     </w:p>
     <w:p>
       <w:r>
-        <w:t>Credit-card fraud alerts require more than a risk score: an analyst also needs a concise and accurate account of the evidence behind that score. SHAP can provide signed feature attribution for a frozen detector, but attribution values remain technical, while a large language model may omit a listed contribution, introduce unsupported information, or reverse its direction. This project therefore evaluates a fail-closed local-LLM explanation layer that treats generated text as an untrusted candidate, validates it against a minimised SHAP evidence package, and replaces detected failures with a deterministic brief.</w:t>
-      </w:r>
-    </w:p>
-    <w:p>
-      <w:r>
-        <w:t>Six detector configurations were first compared on the European Credit Card Fraud dataset using content deduplication, stratified 70/15/15 splits, training-only preprocessing, validation-only threshold selection, and five fixed seeds. G6 produced the numerically highest mean test Average Precision at 0.855214 ± 0.027097, but the differences between the leading configurations were small and the autoencoder variants showed no clear advantage. The frozen G6 seed-42 cost-sensitive XGBoost detector was therefore retained as a reproducible evidence source rather than as an algorithmic contribution. In an anonymous-feature prompt stress test, a strict prompt produced a detected violation in 2/51 raw outputs (3.92%, 95% Wilson interval 1.08% to 13.22%), while a simple prompt produced one in 51/51 (100%, 93.00% to 100%). Every detected failure activated deterministic fallback. Within its versioned template-constrained corpus, the validator intercepted 330/330 attacks and falsely rejected 0/318 faithful controls.</w:t>
-      </w:r>
-    </w:p>
-    <w:p>
-      <w:r>
-        <w:t>The primary semantic evaluation used S0, a synthetic stream of 50,000 transactions with 11 business-readable features and a chronological 70/15/15 split. On the frozen test period, the detector achieved AP 0.544017, precision 0.720000, recall 0.400000, and F1 0.514286 at the validation-selected threshold 0.972929. Among 25 selected alerts, the guarded local-LLM brief passed validation for 23 and activated deterministic fallback for 2. All 23 accepted responses selected the shorter permitted summary and named only the leading signal, so the language layer did not add detail beyond the deterministic brief. The S0 results are synthetic operational simulation evidence and are not compared with the ULB benchmark.</w:t>
-      </w:r>
-    </w:p>
-    <w:p>
-      <w:r>
-        <w:t>An interim human evaluation then compared raw reason codes, deterministic briefs, and guarded LLM briefs with 11 adult proxy reviewers, producing 99 completed case reviews. The sample was below the pre-specified minimum of 18 and target of 30, so no inferential test was performed. Top-evidence accuracy was 28/33 (84.85%) for raw reason codes, 29/33 (87.88%) for deterministic briefs, and 27/33 (81.82%) for guarded LLM briefs. Median clarity was 4/5 for every format. Seven of 11 participants selected the guarded LLM brief as the clearest, and seven selected it as their preferred first-pass format, while 6 of 11 selected the deterministic brief as the most trustworthy. Because case assignment and presentation order were fixed, these descriptive findings do not establish a causal format effect or superiority.</w:t>
-      </w:r>
-    </w:p>
-    <w:p>
-      <w:r>
-        <w:t>The main contribution is an evaluated explanation-delivery process that keeps model evidence separate from LLM-generated wording. Each raw response is measured before validation, and any rejected response is replaced with a deterministic brief built from the original evidence. A React and FastAPI review application reads the same provenance-verified artifacts. A student-conducted blinded manual audit found no semantic violation in the 49 strict-arm narratives that passed the validator (0/49, 0%, 95% Wilson interval 0% to 7.27%). Conclusions remain limited to one historical dataset, one synthetic stream, one local 8B model, 51 ULB cases, 25 S0 alerts, predefined validator grammars, one manual auditor, and 11 proxy reviewers.</w:t>
+        <w:t>Fraud-detection systems depend on machine-learned models whose SHAP explanations are numerical and difficult to interpret quickly. Large language models can render this evidence as fluent text, but their wording may drift from the evidence or overstate certainty. Existing work rarely distinguishes what a model produces from what an analyst receives. This project addresses that gap by treating generated text as an untrusted candidate that must be checked before delivery.</w:t>
+      </w:r>
+    </w:p>
+    <w:p>
+      <w:r>
+        <w:t>The system converts SHAP evidence into fraud-alert briefs with a local large language model, validates each candidate against the supplied evidence, and substitutes a deterministic brief whenever validation fails. The methodology comprised a six-group detector benchmark on the European Credit Card Fraud dataset, a frozen cost-sensitive XGBoost evidence source, strict-versus-simple prompt testing, a versioned adversarial validator corpus, and a synthetic alert stream, S0, with readable features. Evaluation included a blinded manual semantic audit and an interim comparison of raw reason codes, deterministic briefs, and guarded LLM briefs.</w:t>
+      </w:r>
+    </w:p>
+    <w:p>
+      <w:r>
+        <w:t>The strict prompt yielded detected violations in 2 of 51 raw outputs, compared with 51 of 51 for the simple prompt; every detected failure triggered fallback, and a blinded student audit found no judged semantic violations among the 49 strict-arm narratives delivered without fallback (95% Wilson upper bound 7.27%). Of 25 selected S0 alerts, 23 guarded LLM candidates passed validation and 2 triggered fallback; all 23 accepted candidates used the shorter permitted summary and named only the leading signal, adding no detail beyond the deterministic brief. In a descriptive study, 11 proxy reviewers completed 99 case reviews: the guarded brief led on no comprehension check, although 7 of 11 judged it clearest and preferred it for first-pass review, while 6 of 11 judged the deterministic brief most trustworthy.</w:t>
+      </w:r>
+    </w:p>
+    <w:p>
+      <w:r>
+        <w:t>The principal contribution is a fail-closed, evidence-grounded delivery process that measures raw and delivered language-model output separately and keeps rejected text from reaching the analyst, while the principal limitation is reliance on one historical dataset, one synthetic stream, one local 8B model, one student auditor, and 11 proxy reviewers rather than practising fraud analysts.</w:t>
       </w:r>
     </w:p>
     <w:p>

</xml_diff>